<commit_message>
Expand forecast-driven OR analysis and teacher feedback alignment
</commit_message>
<xml_diff>
--- a/docs/Olist_Forecast_OR_Project_Proposal.docx
+++ b/docs/Olist_Forecast_OR_Project_Proposal.docx
@@ -5,7 +5,7 @@
     <w:p>
       <w:pPr>
         <w:rPr>
-          <w:rFonts w:ascii="Times New Roman Bold" w:hAnsi="Times New Roman Bold" w:cs="Times New Roman Bold"/>
+          <w:rFonts w:ascii="Times New Roman" w:hAnsi="Times New Roman" w:cs="Times New Roman" w:eastAsia="Times New Roman"/>
           <w:b/>
           <w:bCs/>
           <w:sz w:val="32"/>
@@ -25,14 +25,14 @@
     <w:p>
       <w:pPr>
         <w:rPr>
-          <w:rFonts w:ascii="Times New Roman Regular" w:hAnsi="Times New Roman Regular" w:cs="Times New Roman Regular"/>
-        </w:rPr>
-      </w:pPr>
-    </w:p>
-    <w:p>
-      <w:pPr>
-        <w:rPr>
-          <w:rFonts w:ascii="Times New Roman Bold" w:hAnsi="Times New Roman Bold" w:cs="Times New Roman Bold"/>
+          <w:rFonts w:ascii="Times New Roman" w:hAnsi="Times New Roman" w:cs="Times New Roman" w:eastAsia="Times New Roman"/>
+        </w:rPr>
+      </w:pPr>
+    </w:p>
+    <w:p>
+      <w:pPr>
+        <w:rPr>
+          <w:rFonts w:ascii="Times New Roman" w:hAnsi="Times New Roman" w:cs="Times New Roman" w:eastAsia="Times New Roman"/>
           <w:b/>
           <w:bCs/>
         </w:rPr>
@@ -49,7 +49,7 @@
     <w:p>
       <w:pPr>
         <w:rPr>
-          <w:rFonts w:ascii="Times New Roman Italic" w:hAnsi="Times New Roman Italic" w:cs="Times New Roman Italic"/>
+          <w:rFonts w:ascii="Times New Roman" w:hAnsi="Times New Roman" w:cs="Times New Roman" w:eastAsia="Times New Roman"/>
           <w:i/>
           <w:iCs/>
         </w:rPr>
@@ -66,14 +66,14 @@
     <w:p>
       <w:pPr>
         <w:rPr>
-          <w:rFonts w:ascii="Times New Roman Regular" w:hAnsi="Times New Roman Regular" w:cs="Times New Roman Regular"/>
-        </w:rPr>
-      </w:pPr>
-    </w:p>
-    <w:p>
-      <w:pPr>
-        <w:rPr>
-          <w:rFonts w:ascii="Times New Roman Bold" w:hAnsi="Times New Roman Bold" w:cs="Times New Roman Bold"/>
+          <w:rFonts w:ascii="Times New Roman" w:hAnsi="Times New Roman" w:cs="Times New Roman" w:eastAsia="Times New Roman"/>
+        </w:rPr>
+      </w:pPr>
+    </w:p>
+    <w:p>
+      <w:pPr>
+        <w:rPr>
+          <w:rFonts w:ascii="Times New Roman" w:hAnsi="Times New Roman" w:cs="Times New Roman" w:eastAsia="Times New Roman"/>
           <w:b/>
           <w:bCs/>
         </w:rPr>
@@ -90,7 +90,7 @@
     <w:p>
       <w:pPr>
         <w:rPr>
-          <w:rFonts w:ascii="Times New Roman Bold" w:hAnsi="Times New Roman Bold" w:cs="Times New Roman Bold"/>
+          <w:rFonts w:ascii="Times New Roman" w:hAnsi="Times New Roman" w:cs="Times New Roman" w:eastAsia="Times New Roman"/>
           <w:b/>
           <w:bCs/>
         </w:rPr>
@@ -106,23 +106,19 @@
     <w:p>
       <w:pPr>
         <w:rPr>
-          <w:rFonts w:ascii="Times New Roman Bold" w:hAnsi="Times New Roman Bold" w:cs="Times New Roman Bold"/>
-          <w:b/>
-          <w:bCs/>
-        </w:rPr>
-      </w:pPr>
-      <w:r>
-        <w:rPr>
-          <w:rFonts w:ascii="Times New Roman" w:eastAsia="Times New Roman" w:hAnsi="Times New Roman" w:cs="Times New Roman"/>
-          <w:szCs w:val="21"/>
-        </w:rPr>
-        <w:t>This project will combine data analysis, demand forecasting, and traditional Operations Research. Historical Olist orders will first be used to identify demand patterns and fulfillment risks by product category and customer region. Forecasts and forecast uncertainty will then become inputs to an inventory and fulfillment optimization model. The model will recommend replenishment and allocation decisions that balance procurement, holding, freight, late-delivery risk, and shortage cost while protecting a minimum regional service level.</w:t>
-      </w:r>
-    </w:p>
-    <w:p>
-      <w:pPr>
-        <w:rPr>
-          <w:rFonts w:ascii="Times New Roman Bold" w:hAnsi="Times New Roman Bold" w:cs="Times New Roman Bold"/>
+          <w:rFonts w:ascii="Times New Roman" w:hAnsi="Times New Roman" w:cs="Times New Roman" w:eastAsia="Times New Roman"/>
+          <w:b/>
+          <w:bCs/>
+        </w:rPr>
+      </w:pPr>
+      <w:r>
+        <w:t>This project will combine data analysis, demand forecasting, and two specific traditional Operations Research models. Historical Olist orders will first be used to identify demand patterns and fulfillment risks by product category, customer region, seller origin, and route. A four-week multi-period inventory-replenishment mixed-integer linear program (MILP) will decide how much inventory to order and where to position it before demand is observed. A capacitated transportation/fulfillment MILP will then allocate realized demand to proxy hubs. Forecasts and past-only forecast errors will enter the first model as safety-adjusted demand, while smoothed historical late-dispatch and late-delivery rates will enter the second model as fulfillment-risk costs.</w:t>
+      </w:r>
+    </w:p>
+    <w:p>
+      <w:pPr>
+        <w:rPr>
+          <w:rFonts w:ascii="Times New Roman" w:hAnsi="Times New Roman" w:cs="Times New Roman" w:eastAsia="Times New Roman"/>
           <w:b/>
           <w:bCs/>
         </w:rPr>
@@ -154,7 +150,7 @@
     <w:p>
       <w:pPr>
         <w:rPr>
-          <w:rFonts w:ascii="Times New Roman Regular" w:hAnsi="Times New Roman Regular" w:cs="Times New Roman Regular"/>
+          <w:rFonts w:ascii="Times New Roman" w:hAnsi="Times New Roman" w:cs="Times New Roman" w:eastAsia="Times New Roman"/>
         </w:rPr>
       </w:pPr>
     </w:p>
@@ -167,66 +163,43 @@
         </w:rPr>
       </w:pPr>
       <w:r>
+        <w:t>3. Literature-Informed Design</w:t>
+      </w:r>
+    </w:p>
+    <w:p>
+      <w:pPr>
         <w:rPr>
           <w:rFonts w:ascii="Times New Roman" w:eastAsia="Times New Roman" w:hAnsi="Times New Roman" w:cs="Times New Roman" w:hint="eastAsia"/>
-          <w:b/>
-          <w:szCs w:val="21"/>
-        </w:rPr>
-        <w:t>3.</w:t>
-      </w:r>
-      <w:r>
-        <w:rPr>
-          <w:rFonts w:ascii="Times New Roman" w:eastAsia="Times New Roman" w:hAnsi="Times New Roman" w:cs="Times New Roman"/>
-          <w:b/>
-          <w:szCs w:val="21"/>
-        </w:rPr>
-        <w:t>Literature-Informed Design</w:t>
-      </w:r>
-    </w:p>
-    <w:p>
-      <w:pPr>
-        <w:rPr>
-          <w:rFonts w:ascii="Times New Roman" w:eastAsia="Times New Roman" w:hAnsi="Times New Roman" w:cs="Times New Roman" w:hint="eastAsia"/>
-          <w:bCs/>
-          <w:szCs w:val="21"/>
-        </w:rPr>
-      </w:pPr>
-      <w:r>
-        <w:rPr>
-          <w:rFonts w:ascii="Times New Roman" w:eastAsia="Times New Roman" w:hAnsi="Times New Roman" w:cs="Times New Roman"/>
-          <w:bCs/>
-          <w:szCs w:val="21"/>
-        </w:rPr>
-        <w:t>The proposal combines three literature streams. Forecasting research recommends chronological validation and comparison against simple benchmarks, because a complex model is useful only when it improves out-of-sample performance. Inventory research shows that point forecasts should be adjusted for uncertainty before they enter replenishment decisions. Predict-then-optimize research further argues that forecasts should be judged by their downstream cost and service consequences, not by forecast error alone.</w:t>
-      </w:r>
-    </w:p>
-    <w:p>
-      <w:pPr>
-        <w:rPr>
-          <w:rFonts w:ascii="Times New Roman Bold" w:hAnsi="Times New Roman Bold" w:cs="Times New Roman Bold"/>
-          <w:bCs/>
-        </w:rPr>
-      </w:pPr>
-      <w:r>
-        <w:rPr>
-          <w:rFonts w:ascii="Times New Roman" w:eastAsia="Times New Roman" w:hAnsi="Times New Roman" w:cs="Times New Roman"/>
-          <w:bCs/>
-          <w:szCs w:val="21"/>
-        </w:rPr>
-        <w:t>These ideas lead to one integrated workflow: construct a leakage-safe demand panel; compare last-week, moving-average, and Ridge forecasts; convert the selected forecast into safety-adjusted planning demand; solve inventory and fulfillment models; and evaluate total cost, fill rate, stockouts, and sensitivity to uncertain parameters.</w:t>
-      </w:r>
-    </w:p>
-    <w:p>
-      <w:pPr>
-        <w:rPr>
-          <w:rFonts w:ascii="Times New Roman Regular" w:hAnsi="Times New Roman Regular" w:cs="Times New Roman Regular"/>
-        </w:rPr>
-      </w:pPr>
-    </w:p>
-    <w:p>
-      <w:pPr>
-        <w:rPr>
-          <w:rFonts w:ascii="Times New Roman Bold" w:hAnsi="Times New Roman Bold" w:cs="Times New Roman Bold"/>
+          <w:bCs/>
+          <w:szCs w:val="21"/>
+        </w:rPr>
+      </w:pPr>
+      <w:r>
+        <w:t>The proposal combines three literature streams. Forecasting research recommends chronological validation and comparison against transparent naive and moving-average benchmarks because model value must be demonstrated out of sample (Hyndman &amp; Athanasopoulos, 2021; Fildes et al., 2022). Inventory research shows that point forecasts should be adjusted for uncertainty before they enter replenishment decisions (Snyder &amp; Shen, 2019). Predict-then-optimize research further argues that forecasts should be judged by their downstream cost and service consequences, not by forecast error alone (Bertsimas &amp; Kallus, 2020; Elmachtoub &amp; Grigas, 2022).</w:t>
+      </w:r>
+    </w:p>
+    <w:p>
+      <w:pPr>
+        <w:rPr>
+          <w:rFonts w:ascii="Times New Roman" w:hAnsi="Times New Roman" w:cs="Times New Roman" w:eastAsia="Times New Roman"/>
+          <w:bCs/>
+        </w:rPr>
+      </w:pPr>
+      <w:r>
+        <w:t>These ideas lead to one integrated workflow: construct a leakage-safe weekly demand panel; compare a last-week naive forecast, a four-week moving average, and a pooled Ridge regression; estimate each method's error scale using an eight-week chronological holdout available at the forecast origin; convert forecasts into safety-adjusted planning demand; solve the inventory and fulfillment MILPs; and compare total cost, fill rate, shortages, regional service, and sensitivity under an identical operating environment.</w:t>
+      </w:r>
+    </w:p>
+    <w:p>
+      <w:pPr>
+        <w:rPr>
+          <w:rFonts w:ascii="Times New Roman" w:hAnsi="Times New Roman" w:cs="Times New Roman" w:eastAsia="Times New Roman"/>
+        </w:rPr>
+      </w:pPr>
+    </w:p>
+    <w:p>
+      <w:pPr>
+        <w:rPr>
+          <w:rFonts w:ascii="Times New Roman" w:hAnsi="Times New Roman" w:cs="Times New Roman" w:eastAsia="Times New Roman"/>
           <w:b/>
           <w:bCs/>
         </w:rPr>
@@ -243,7 +216,7 @@
     <w:p>
       <w:pPr>
         <w:rPr>
-          <w:rFonts w:ascii="Times New Roman Bold" w:hAnsi="Times New Roman Bold" w:cs="Times New Roman Bold"/>
+          <w:rFonts w:ascii="Times New Roman" w:hAnsi="Times New Roman" w:cs="Times New Roman" w:eastAsia="Times New Roman"/>
           <w:b/>
           <w:bCs/>
         </w:rPr>
@@ -260,7 +233,7 @@
     <w:p>
       <w:pPr>
         <w:rPr>
-          <w:rFonts w:ascii="Times New Roman Bold" w:hAnsi="Times New Roman Bold" w:cs="Times New Roman Bold"/>
+          <w:rFonts w:ascii="Times New Roman" w:hAnsi="Times New Roman" w:cs="Times New Roman" w:eastAsia="Times New Roman"/>
           <w:b/>
           <w:bCs/>
         </w:rPr>
@@ -276,7 +249,7 @@
     <w:p>
       <w:pPr>
         <w:rPr>
-          <w:rFonts w:ascii="Times New Roman Bold" w:hAnsi="Times New Roman Bold" w:cs="Times New Roman Bold"/>
+          <w:rFonts w:ascii="Times New Roman" w:hAnsi="Times New Roman" w:cs="Times New Roman" w:eastAsia="Times New Roman"/>
           <w:b/>
           <w:bCs/>
         </w:rPr>
@@ -293,7 +266,7 @@
     <w:p>
       <w:pPr>
         <w:rPr>
-          <w:rFonts w:ascii="Times New Roman Bold" w:hAnsi="Times New Roman Bold" w:cs="Times New Roman Bold"/>
+          <w:rFonts w:ascii="Times New Roman" w:hAnsi="Times New Roman" w:cs="Times New Roman" w:eastAsia="Times New Roman"/>
           <w:b/>
           <w:bCs/>
         </w:rPr>
@@ -310,7 +283,7 @@
     <w:p>
       <w:pPr>
         <w:rPr>
-          <w:rFonts w:ascii="Times New Roman Bold" w:hAnsi="Times New Roman Bold" w:cs="Times New Roman Bold"/>
+          <w:rFonts w:ascii="Times New Roman" w:hAnsi="Times New Roman" w:cs="Times New Roman" w:eastAsia="Times New Roman"/>
           <w:b/>
           <w:bCs/>
         </w:rPr>
@@ -327,23 +300,19 @@
     <w:p>
       <w:pPr>
         <w:rPr>
-          <w:rFonts w:ascii="Times New Roman Bold" w:hAnsi="Times New Roman Bold" w:cs="Times New Roman Bold"/>
-          <w:b/>
-          <w:bCs/>
-        </w:rPr>
-      </w:pPr>
-      <w:r>
-        <w:rPr>
-          <w:rFonts w:ascii="Times New Roman" w:eastAsia="Times New Roman" w:hAnsi="Times New Roman" w:cs="Times New Roman"/>
-          <w:szCs w:val="21"/>
-        </w:rPr>
-        <w:t>Olist does not report actual warehouse inventory, procurement cost, replenishment capacity, or warehouse handling capacity. The proposal will therefore use a transparent scenario with six seller-state proxy hubs (SP, PR, MG, RJ, SC, and RS), a four-week planning horizon, one-week replenishment lead time, initial inventory based on two weeks of average demand and historical supply share, handling capacity based on 1.35 times the 90th percentile of shipped weight (with a 50 kg floor), and replenishment capacity based on 1.50 times the 90th percentile of weekly units. The base scenario will set procurement cost to 60% of category median price, weekly holding cost to 1% of median price, shortage penalty to 125% of median price plus median freight, the regional service target to 90%, and the late-route and seller-risk weights to 8 and 5. These assumptions will then be varied in sensitivity analysis.</w:t>
-      </w:r>
-    </w:p>
-    <w:p>
-      <w:pPr>
-        <w:rPr>
-          <w:rFonts w:ascii="Times New Roman Bold" w:hAnsi="Times New Roman Bold" w:cs="Times New Roman Bold"/>
+          <w:rFonts w:ascii="Times New Roman" w:hAnsi="Times New Roman" w:cs="Times New Roman" w:eastAsia="Times New Roman"/>
+          <w:b/>
+          <w:bCs/>
+        </w:rPr>
+      </w:pPr>
+      <w:r>
+        <w:t>Olist does not report warehouse inventory, procurement cost, replenishment capacity, or hub throughput. The implementation will therefore use a transparent scenario rather than treating these values as observed facts. Six seller-state proxy hubs (SP, PR, MG, RJ, SC, and RS) are selected because they represent the largest historical seller-origin concentrations. A four-week horizon balances operational relevance with the eight-day project schedule, and a one-week lead time reflects the weekly decision frequency. Initial inventory equals two average-demand weeks to provide a neutral starting stock. Throughput and replenishment capacities are tied to historical 90th-percentile activity (multipliers 1.35 and 1.50) so the network can serve high but plausible weeks without making capacity unlimited. Procurement cost is 60% of median product price, weekly holding cost is 1%, and shortage penalty is 125% plus median freight to encode the intended ordering shortage &gt; procurement &gt; holding. The 90% service target is a clear, feasible baseline; route- and seller-risk weights of 8 and 5 make historical delay risk visible without dominating freight. Because these are scenario choices, the project will vary safety stock, service target, capacity, lead time, shortage penalty, and risk weights and will report which conclusions remain stable.</w:t>
+      </w:r>
+    </w:p>
+    <w:p>
+      <w:pPr>
+        <w:rPr>
+          <w:rFonts w:ascii="Times New Roman" w:hAnsi="Times New Roman" w:cs="Times New Roman" w:eastAsia="Times New Roman"/>
           <w:b/>
           <w:bCs/>
         </w:rPr>
@@ -360,7 +329,7 @@
     <w:p>
       <w:pPr>
         <w:rPr>
-          <w:rFonts w:ascii="Times New Roman Bold" w:hAnsi="Times New Roman Bold" w:cs="Times New Roman Bold"/>
+          <w:rFonts w:ascii="Times New Roman" w:hAnsi="Times New Roman" w:cs="Times New Roman" w:eastAsia="Times New Roman"/>
           <w:b/>
           <w:bCs/>
         </w:rPr>
@@ -376,14 +345,14 @@
     <w:p>
       <w:pPr>
         <w:rPr>
-          <w:rFonts w:ascii="Times New Roman Regular" w:hAnsi="Times New Roman Regular" w:cs="Times New Roman Regular"/>
-        </w:rPr>
-      </w:pPr>
-    </w:p>
-    <w:p>
-      <w:pPr>
-        <w:rPr>
-          <w:rFonts w:ascii="Times New Roman Bold" w:hAnsi="Times New Roman Bold" w:cs="Times New Roman Bold"/>
+          <w:rFonts w:ascii="Times New Roman" w:hAnsi="Times New Roman" w:cs="Times New Roman" w:eastAsia="Times New Roman"/>
+        </w:rPr>
+      </w:pPr>
+    </w:p>
+    <w:p>
+      <w:pPr>
+        <w:rPr>
+          <w:rFonts w:ascii="Times New Roman" w:hAnsi="Times New Roman" w:cs="Times New Roman" w:eastAsia="Times New Roman"/>
           <w:b/>
           <w:bCs/>
         </w:rPr>
@@ -400,158 +369,62 @@
     <w:p>
       <w:pPr>
         <w:rPr>
-          <w:rFonts w:ascii="Times New Roman Bold" w:hAnsi="Times New Roman Bold" w:cs="Times New Roman Bold"/>
-          <w:b/>
-          <w:bCs/>
-        </w:rPr>
-      </w:pPr>
-      <w:r>
-        <w:rPr>
-          <w:rFonts w:ascii="Times New Roman" w:eastAsia="Times New Roman" w:hAnsi="Times New Roman" w:cs="Times New Roman"/>
-          <w:b/>
-          <w:szCs w:val="21"/>
-        </w:rPr>
-        <w:t xml:space="preserve">Main question. </w:t>
-      </w:r>
-      <w:r>
-        <w:rPr>
-          <w:rFonts w:ascii="Times New Roman" w:eastAsia="Times New Roman" w:hAnsi="Times New Roman" w:cs="Times New Roman"/>
-          <w:szCs w:val="21"/>
-        </w:rPr>
-        <w:t>Can forecast-driven inventory and fulfillment decisions reduce simulated total cost while maintaining regional service levels under Olist-derived demand and risk patterns?</w:t>
-      </w:r>
-    </w:p>
-    <w:p>
-      <w:pPr>
-        <w:rPr>
-          <w:rFonts w:ascii="Times New Roman Bold" w:hAnsi="Times New Roman Bold" w:cs="Times New Roman Bold"/>
-          <w:b/>
-          <w:bCs/>
-        </w:rPr>
-      </w:pPr>
-      <w:r>
-        <w:rPr>
-          <w:rFonts w:ascii="Times New Roman" w:eastAsia="Times New Roman" w:hAnsi="Times New Roman" w:cs="Times New Roman"/>
-          <w:b/>
-          <w:szCs w:val="21"/>
-        </w:rPr>
-        <w:t xml:space="preserve">RQ1. </w:t>
-      </w:r>
-      <w:r>
-        <w:rPr>
-          <w:rFonts w:ascii="Times New Roman" w:eastAsia="Times New Roman" w:hAnsi="Times New Roman" w:cs="Times New Roman"/>
-          <w:szCs w:val="21"/>
-        </w:rPr>
-        <w:t>How predictable is weekly demand for each product-category and customer-region combination?</w:t>
-      </w:r>
-    </w:p>
-    <w:p>
-      <w:pPr>
-        <w:rPr>
-          <w:rFonts w:ascii="Times New Roman Bold" w:hAnsi="Times New Roman Bold" w:cs="Times New Roman Bold"/>
-          <w:b/>
-          <w:bCs/>
-        </w:rPr>
-      </w:pPr>
-      <w:r>
-        <w:rPr>
-          <w:rFonts w:ascii="Times New Roman" w:eastAsia="Times New Roman" w:hAnsi="Times New Roman" w:cs="Times New Roman"/>
-          <w:b/>
-          <w:szCs w:val="21"/>
-        </w:rPr>
-        <w:t xml:space="preserve">RQ2. </w:t>
-      </w:r>
-      <w:r>
-        <w:rPr>
-          <w:rFonts w:ascii="Times New Roman" w:eastAsia="Times New Roman" w:hAnsi="Times New Roman" w:cs="Times New Roman"/>
-          <w:szCs w:val="21"/>
-        </w:rPr>
-        <w:t>How should forecast uncertainty be converted into safety-adjusted planning demand and replenishment decisions?</w:t>
-      </w:r>
-    </w:p>
-    <w:p>
-      <w:pPr>
-        <w:rPr>
-          <w:rFonts w:ascii="Times New Roman Bold" w:hAnsi="Times New Roman Bold" w:cs="Times New Roman Bold"/>
-          <w:b/>
-          <w:bCs/>
-        </w:rPr>
-      </w:pPr>
-      <w:r>
-        <w:rPr>
-          <w:rFonts w:ascii="Times New Roman" w:eastAsia="Times New Roman" w:hAnsi="Times New Roman" w:cs="Times New Roman"/>
-          <w:b/>
-          <w:szCs w:val="21"/>
-        </w:rPr>
-        <w:t xml:space="preserve">RQ3. </w:t>
-      </w:r>
-      <w:r>
-        <w:rPr>
-          <w:rFonts w:ascii="Times New Roman" w:eastAsia="Times New Roman" w:hAnsi="Times New Roman" w:cs="Times New Roman"/>
-          <w:szCs w:val="21"/>
-        </w:rPr>
-        <w:t>Which categories, customer regions, and seller-origin routes create the highest demand or fulfillment risk?</w:t>
-      </w:r>
-    </w:p>
-    <w:p>
-      <w:pPr>
-        <w:rPr>
-          <w:rFonts w:ascii="Times New Roman Bold" w:hAnsi="Times New Roman Bold" w:cs="Times New Roman Bold"/>
-          <w:b/>
-          <w:bCs/>
-        </w:rPr>
-      </w:pPr>
-      <w:r>
-        <w:rPr>
-          <w:rFonts w:ascii="Times New Roman" w:eastAsia="Times New Roman" w:hAnsi="Times New Roman" w:cs="Times New Roman"/>
-          <w:b/>
-          <w:szCs w:val="21"/>
-        </w:rPr>
-        <w:t xml:space="preserve">RQ4. </w:t>
-      </w:r>
-      <w:r>
-        <w:rPr>
-          <w:rFonts w:ascii="Times New Roman" w:eastAsia="Times New Roman" w:hAnsi="Times New Roman" w:cs="Times New Roman"/>
-          <w:szCs w:val="21"/>
-        </w:rPr>
-        <w:t>How should inventory be replenished and allocated under stock, throughput, replenishment-capacity, and regional-service constraints?</w:t>
-      </w:r>
-    </w:p>
-    <w:p>
-      <w:pPr>
-        <w:rPr>
-          <w:rFonts w:ascii="Times New Roman Bold" w:hAnsi="Times New Roman Bold" w:cs="Times New Roman Bold"/>
-          <w:b/>
-          <w:bCs/>
-        </w:rPr>
-      </w:pPr>
-      <w:r>
-        <w:rPr>
-          <w:rFonts w:ascii="Times New Roman" w:eastAsia="Times New Roman" w:hAnsi="Times New Roman" w:cs="Times New Roman"/>
-          <w:b/>
-          <w:szCs w:val="21"/>
-        </w:rPr>
-        <w:t xml:space="preserve">RQ5. </w:t>
-      </w:r>
-      <w:r>
-        <w:rPr>
-          <w:rFonts w:ascii="Times New Roman" w:eastAsia="Times New Roman" w:hAnsi="Times New Roman" w:cs="Times New Roman"/>
-          <w:szCs w:val="21"/>
-        </w:rPr>
-        <w:t>When does the pooled forecast-plus-OR policy outperform simple forecast-plus-OR benchmarks in both cost and service?</w:t>
-      </w:r>
-    </w:p>
-    <w:p>
-      <w:pPr>
-        <w:rPr>
-          <w:rFonts w:ascii="Times New Roman Regular" w:hAnsi="Times New Roman Regular" w:cs="Times New Roman Regular"/>
-        </w:rPr>
-      </w:pPr>
-    </w:p>
-    <w:p>
-      <w:pPr>
-        <w:rPr>
-          <w:rFonts w:ascii="Times New Roman Bold" w:hAnsi="Times New Roman Bold" w:cs="Times New Roman Bold"/>
+          <w:rFonts w:ascii="Times New Roman" w:hAnsi="Times New Roman" w:cs="Times New Roman" w:eastAsia="Times New Roman"/>
+          <w:b/>
+          <w:bCs/>
+        </w:rPr>
+      </w:pPr>
+      <w:r>
+        <w:t>Main question. What decision-relevant value is created when Olist-derived demand and fulfillment-risk patterns are converted into forecast-driven inventory and fulfillment decisions?</w:t>
+      </w:r>
+    </w:p>
+    <w:p>
+      <w:pPr>
+        <w:rPr>
+          <w:rFonts w:ascii="Times New Roman" w:hAnsi="Times New Roman" w:cs="Times New Roman" w:eastAsia="Times New Roman"/>
+          <w:b/>
+          <w:bCs/>
+        </w:rPr>
+      </w:pPr>
+      <w:r>
+        <w:t>RQ1. Where are demand, forecast difficulty, and fulfillment risk concentrated across categories, customer regions, seller origins, and routes?</w:t>
+      </w:r>
+    </w:p>
+    <w:p>
+      <w:pPr>
+        <w:rPr>
+          <w:rFonts w:ascii="Times New Roman" w:hAnsi="Times New Roman" w:cs="Times New Roman" w:eastAsia="Times New Roman"/>
+          <w:b/>
+          <w:bCs/>
+        </w:rPr>
+      </w:pPr>
+      <w:r>
+        <w:t>RQ2. Does pooled Ridge regression improve chronological out-of-sample accuracy over last-week and four-week moving-average benchmarks, overall and by category-region segment?</w:t>
+      </w:r>
+    </w:p>
+    <w:p>
+      <w:pPr>
+        <w:rPr>
+          <w:rFonts w:ascii="Times New Roman" w:hAnsi="Times New Roman" w:cs="Times New Roman" w:eastAsia="Times New Roman"/>
+          <w:b/>
+          <w:bCs/>
+        </w:rPr>
+      </w:pPr>
+      <w:r>
+        <w:t>RQ3. When forecasts and past-only uncertainty estimates enter a four-week inventory-replenishment MILP and a capacitated fulfillment MILP, how do policies differ in simulated cost, fill rate, shortages, regional service, and robustness to scenario assumptions?</w:t>
+      </w:r>
+    </w:p>
+    <w:p>
+      <w:pPr>
+        <w:rPr>
+          <w:rFonts w:ascii="Times New Roman" w:hAnsi="Times New Roman" w:cs="Times New Roman" w:eastAsia="Times New Roman"/>
+        </w:rPr>
+      </w:pPr>
+    </w:p>
+    <w:p>
+      <w:pPr>
+        <w:rPr>
+          <w:rFonts w:ascii="Times New Roman" w:hAnsi="Times New Roman" w:cs="Times New Roman" w:eastAsia="Times New Roman"/>
           <w:b/>
           <w:bCs/>
         </w:rPr>
@@ -568,24 +441,20 @@
     <w:p>
       <w:pPr>
         <w:rPr>
-          <w:rFonts w:ascii="Times New Roman Bold" w:hAnsi="Times New Roman Bold" w:cs="Times New Roman Bold"/>
-          <w:b/>
-          <w:bCs/>
-        </w:rPr>
-      </w:pPr>
-      <w:r>
-        <w:rPr>
-          <w:rFonts w:ascii="Times New Roman" w:eastAsia="Times New Roman" w:hAnsi="Times New Roman" w:cs="Times New Roman"/>
-          <w:szCs w:val="21"/>
-        </w:rPr>
-        <w:t>Let D with subscripts c, r, and t denote observed unit demand for category c in customer region r during week t. Two transparent forecasts will be retained: last-week demand and a four-week moving average. The main candidate model will be a pooled Ridge regression trained across all 50 related series. Its features will include demand lags at one, two, four, and eight weeks; four- and eight-week rolling means; a time trend; calendar indicators; and category and region indicators. Pooling is intended to share information across sparse series while regularization limits overfitting.</w:t>
+          <w:rFonts w:ascii="Times New Roman" w:hAnsi="Times New Roman" w:cs="Times New Roman" w:eastAsia="Times New Roman"/>
+          <w:b/>
+          <w:bCs/>
+        </w:rPr>
+      </w:pPr>
+      <w:r>
+        <w:t>Let D with subscripts c, r, and t denote observed unit demand for category c in customer region r during week t. Two transparent benchmarks will be retained: last-week demand and a four-week moving average. The main candidate will be a pooled Ridge regression trained across all 50 related series. Features include lags at one, two, four, and eight weeks; four- and eight-week rolling means; a time trend; calendar indicators; and category and region indicators. At every forecast origin, the Ridge penalty will be selected from {1, 5, 25, 100} using only the most recent eight fully observed weeks. Pooling shares information across sparse series, while regularization and chronological tuning limit overfitting.</w:t>
       </w:r>
     </w:p>
     <w:p>
       <w:pPr>
         <w:jc w:val="center"/>
         <w:rPr>
-          <w:rFonts w:ascii="Times New Roman Bold" w:hAnsi="Times New Roman Bold" w:cs="Times New Roman Bold"/>
+          <w:rFonts w:ascii="Times New Roman" w:hAnsi="Times New Roman" w:cs="Times New Roman" w:eastAsia="Times New Roman"/>
           <w:b/>
           <w:bCs/>
         </w:rPr>
@@ -596,7 +465,7 @@
             <m:sSupPr>
               <m:ctrlPr>
                 <w:rPr>
-                  <w:rFonts w:ascii="Cambria Math" w:hAnsi="Cambria Math"/>
+                  <w:rFonts w:ascii="Times New Roman" w:hAnsi="Times New Roman" w:eastAsia="Times New Roman" w:cs="Times New Roman"/>
                 </w:rPr>
               </m:ctrlPr>
             </m:sSupPr>
@@ -630,7 +499,7 @@
             <m:limLowPr>
               <m:ctrlPr>
                 <w:rPr>
-                  <w:rFonts w:ascii="Cambria Math" w:hAnsi="Cambria Math"/>
+                  <w:rFonts w:ascii="Times New Roman" w:hAnsi="Times New Roman" w:eastAsia="Times New Roman" w:cs="Times New Roman"/>
                 </w:rPr>
               </m:ctrlPr>
             </m:limLowPr>
@@ -664,7 +533,7 @@
               <m:supHide m:val="1"/>
               <m:ctrlPr>
                 <w:rPr>
-                  <w:rFonts w:ascii="Cambria Math" w:hAnsi="Cambria Math"/>
+                  <w:rFonts w:ascii="Times New Roman" w:hAnsi="Times New Roman" w:eastAsia="Times New Roman" w:cs="Times New Roman"/>
                 </w:rPr>
               </m:ctrlPr>
             </m:naryPr>
@@ -680,7 +549,7 @@
                 <m:sSubPr>
                   <m:ctrlPr>
                     <w:rPr>
-                      <w:rFonts w:ascii="Cambria Math" w:hAnsi="Cambria Math"/>
+                      <w:rFonts w:ascii="Times New Roman" w:hAnsi="Times New Roman" w:eastAsia="Times New Roman" w:cs="Times New Roman"/>
                     </w:rPr>
                   </m:ctrlPr>
                 </m:sSubPr>
@@ -713,7 +582,7 @@
                 <m:sSupPr>
                   <m:ctrlPr>
                     <w:rPr>
-                      <w:rFonts w:ascii="Cambria Math" w:hAnsi="Cambria Math"/>
+                      <w:rFonts w:ascii="Times New Roman" w:hAnsi="Times New Roman" w:eastAsia="Times New Roman" w:cs="Times New Roman"/>
                     </w:rPr>
                   </m:ctrlPr>
                 </m:sSupPr>
@@ -725,7 +594,7 @@
                       <m:endChr m:val="]"/>
                       <m:ctrlPr>
                         <w:rPr>
-                          <w:rFonts w:ascii="Cambria Math" w:hAnsi="Cambria Math"/>
+                          <w:rFonts w:ascii="Times New Roman" w:hAnsi="Times New Roman" w:eastAsia="Times New Roman" w:cs="Times New Roman"/>
                         </w:rPr>
                       </m:ctrlPr>
                     </m:dPr>
@@ -734,7 +603,7 @@
                         <m:sSubPr>
                           <m:ctrlPr>
                             <w:rPr>
-                              <w:rFonts w:ascii="Cambria Math" w:hAnsi="Cambria Math"/>
+                              <w:rFonts w:ascii="Times New Roman" w:hAnsi="Times New Roman" w:eastAsia="Times New Roman" w:cs="Times New Roman"/>
                             </w:rPr>
                           </m:ctrlPr>
                         </m:sSubPr>
@@ -763,7 +632,7 @@
                         <m:sSubPr>
                           <m:ctrlPr>
                             <w:rPr>
-                              <w:rFonts w:ascii="Cambria Math" w:hAnsi="Cambria Math"/>
+                              <w:rFonts w:ascii="Times New Roman" w:hAnsi="Times New Roman" w:eastAsia="Times New Roman" w:cs="Times New Roman"/>
                             </w:rPr>
                           </m:ctrlPr>
                         </m:sSubPr>
@@ -792,7 +661,7 @@
                         <m:sSubSupPr>
                           <m:ctrlPr>
                             <w:rPr>
-                              <w:rFonts w:ascii="Cambria Math" w:hAnsi="Cambria Math"/>
+                              <w:rFonts w:ascii="Times New Roman" w:hAnsi="Times New Roman" w:eastAsia="Times New Roman" w:cs="Times New Roman"/>
                             </w:rPr>
                           </m:ctrlPr>
                         </m:sSubSupPr>
@@ -860,7 +729,7 @@
               <m:grow m:val="1"/>
               <m:ctrlPr>
                 <w:rPr>
-                  <w:rFonts w:ascii="Cambria Math" w:hAnsi="Cambria Math"/>
+                  <w:rFonts w:ascii="Times New Roman" w:hAnsi="Times New Roman" w:eastAsia="Times New Roman" w:cs="Times New Roman"/>
                 </w:rPr>
               </m:ctrlPr>
             </m:naryPr>
@@ -887,7 +756,7 @@
                 <m:sSubSupPr>
                   <m:ctrlPr>
                     <w:rPr>
-                      <w:rFonts w:ascii="Cambria Math" w:hAnsi="Cambria Math"/>
+                      <w:rFonts w:ascii="Times New Roman" w:hAnsi="Times New Roman" w:eastAsia="Times New Roman" w:cs="Times New Roman"/>
                     </w:rPr>
                   </m:ctrlPr>
                 </m:sSubSupPr>
@@ -928,7 +797,7 @@
       <w:pPr>
         <w:jc w:val="center"/>
         <w:rPr>
-          <w:rFonts w:ascii="Times New Roman Bold" w:hAnsi="Times New Roman Bold" w:cs="Times New Roman Bold"/>
+          <w:rFonts w:ascii="Times New Roman" w:hAnsi="Times New Roman" w:cs="Times New Roman" w:eastAsia="Times New Roman"/>
           <w:b/>
           <w:bCs/>
         </w:rPr>
@@ -939,7 +808,7 @@
             <m:sSubPr>
               <m:ctrlPr>
                 <w:rPr>
-                  <w:rFonts w:ascii="Cambria Math" w:hAnsi="Cambria Math"/>
+                  <w:rFonts w:ascii="Times New Roman" w:hAnsi="Times New Roman" w:eastAsia="Times New Roman" w:cs="Times New Roman"/>
                 </w:rPr>
               </m:ctrlPr>
             </m:sSubPr>
@@ -948,7 +817,7 @@
                 <m:accPr>
                   <m:ctrlPr>
                     <w:rPr>
-                      <w:rFonts w:ascii="Cambria Math" w:hAnsi="Cambria Math"/>
+                      <w:rFonts w:ascii="Times New Roman" w:hAnsi="Times New Roman" w:eastAsia="Times New Roman" w:cs="Times New Roman"/>
                     </w:rPr>
                   </m:ctrlPr>
                 </m:accPr>
@@ -1001,7 +870,7 @@
             <m:sSubSupPr>
               <m:ctrlPr>
                 <w:rPr>
-                  <w:rFonts w:ascii="Cambria Math" w:hAnsi="Cambria Math"/>
+                  <w:rFonts w:ascii="Times New Roman" w:hAnsi="Times New Roman" w:eastAsia="Times New Roman" w:cs="Times New Roman"/>
                 </w:rPr>
               </m:ctrlPr>
             </m:sSubSupPr>
@@ -1044,7 +913,7 @@
             <m:sSubSupPr>
               <m:ctrlPr>
                 <w:rPr>
-                  <w:rFonts w:ascii="Cambria Math" w:hAnsi="Cambria Math"/>
+                  <w:rFonts w:ascii="Times New Roman" w:hAnsi="Times New Roman" w:eastAsia="Times New Roman" w:cs="Times New Roman"/>
                 </w:rPr>
               </m:ctrlPr>
             </m:sSubSupPr>
@@ -1080,7 +949,7 @@
             <m:sSupPr>
               <m:ctrlPr>
                 <w:rPr>
-                  <w:rFonts w:ascii="Cambria Math" w:hAnsi="Cambria Math"/>
+                  <w:rFonts w:ascii="Times New Roman" w:hAnsi="Times New Roman" w:eastAsia="Times New Roman" w:cs="Times New Roman"/>
                 </w:rPr>
               </m:ctrlPr>
             </m:sSupPr>
@@ -1116,30 +985,26 @@
     <w:p>
       <w:pPr>
         <w:rPr>
-          <w:rFonts w:ascii="Times New Roman Bold" w:hAnsi="Times New Roman Bold" w:cs="Times New Roman Bold"/>
-          <w:b/>
-          <w:bCs/>
-        </w:rPr>
-      </w:pPr>
-      <w:r>
-        <w:rPr>
-          <w:rFonts w:ascii="Times New Roman" w:eastAsia="Times New Roman" w:hAnsi="Times New Roman" w:cs="Times New Roman"/>
-          <w:szCs w:val="21"/>
-        </w:rPr>
-        <w:t>The forecast will be estimated using expanding-window chronological validation. Every lag, rolling feature, and residual statistic will use information available before the forecast origin. Forecast performance will be reported with WAPE, MAE, and signed bias at both aggregate and category-region levels.</w:t>
-      </w:r>
-    </w:p>
-    <w:p>
-      <w:pPr>
-        <w:rPr>
-          <w:rFonts w:ascii="Times New Roman Regular" w:hAnsi="Times New Roman Regular" w:cs="Times New Roman Regular"/>
-        </w:rPr>
-      </w:pPr>
-    </w:p>
-    <w:p>
-      <w:pPr>
-        <w:rPr>
-          <w:rFonts w:ascii="Times New Roman Bold" w:hAnsi="Times New Roman Bold" w:cs="Times New Roman Bold"/>
+          <w:rFonts w:ascii="Times New Roman" w:hAnsi="Times New Roman" w:cs="Times New Roman" w:eastAsia="Times New Roman"/>
+          <w:b/>
+          <w:bCs/>
+        </w:rPr>
+      </w:pPr>
+      <w:r>
+        <w:t>Forecasts will be estimated using an expanding-window rolling-origin design. Every lag, rolling feature, hyperparameter choice, and residual statistic will use only information available before the forecast origin. Forecast performance will be reported with WAPE, MAE, and signed bias at aggregate and category-region levels. Segment-level winners will also be reported so that aggregate accuracy does not hide important regional or category differences.</w:t>
+      </w:r>
+    </w:p>
+    <w:p>
+      <w:pPr>
+        <w:rPr>
+          <w:rFonts w:ascii="Times New Roman" w:hAnsi="Times New Roman" w:cs="Times New Roman" w:eastAsia="Times New Roman"/>
+        </w:rPr>
+      </w:pPr>
+    </w:p>
+    <w:p>
+      <w:pPr>
+        <w:rPr>
+          <w:rFonts w:ascii="Times New Roman" w:hAnsi="Times New Roman" w:cs="Times New Roman" w:eastAsia="Times New Roman"/>
           <w:b/>
           <w:bCs/>
         </w:rPr>
@@ -1156,24 +1021,20 @@
     <w:p>
       <w:pPr>
         <w:rPr>
-          <w:rFonts w:ascii="Times New Roman Bold" w:hAnsi="Times New Roman Bold" w:cs="Times New Roman Bold"/>
-          <w:b/>
-          <w:bCs/>
-        </w:rPr>
-      </w:pPr>
-      <w:r>
-        <w:rPr>
-          <w:rFonts w:ascii="Times New Roman" w:eastAsia="Times New Roman" w:hAnsi="Times New Roman" w:cs="Times New Roman"/>
-          <w:szCs w:val="21"/>
-        </w:rPr>
-        <w:t>The optimization model will not treat a point forecast as certain demand. Let s denote a past-only residual scale for each category-region series and let zeta be a safety multiplier. The safety-adjusted planning demand is:</w:t>
+          <w:rFonts w:ascii="Times New Roman" w:hAnsi="Times New Roman" w:cs="Times New Roman" w:eastAsia="Times New Roman"/>
+          <w:b/>
+          <w:bCs/>
+        </w:rPr>
+      </w:pPr>
+      <w:r>
+        <w:t>The optimization model will not treat a point forecast as certain demand. Let s denote the mean absolute forecast error for each category-region series, estimated from the latest eight chronological holdout weeks available at the decision time, and let zeta be a safety multiplier. Each forecasting method receives its own past-only error scale. The safety-adjusted planning demand is:</w:t>
       </w:r>
     </w:p>
     <w:p>
       <w:pPr>
         <w:jc w:val="center"/>
         <w:rPr>
-          <w:rFonts w:ascii="Times New Roman Bold" w:hAnsi="Times New Roman Bold" w:cs="Times New Roman Bold"/>
+          <w:rFonts w:ascii="Times New Roman" w:hAnsi="Times New Roman" w:cs="Times New Roman" w:eastAsia="Times New Roman"/>
           <w:b/>
           <w:bCs/>
         </w:rPr>
@@ -1184,7 +1045,7 @@
             <m:sSubPr>
               <m:ctrlPr>
                 <w:rPr>
-                  <w:rFonts w:ascii="Cambria Math" w:hAnsi="Cambria Math"/>
+                  <w:rFonts w:ascii="Times New Roman" w:hAnsi="Times New Roman" w:eastAsia="Times New Roman" w:cs="Times New Roman"/>
                 </w:rPr>
               </m:ctrlPr>
             </m:sSubPr>
@@ -1194,7 +1055,7 @@
                   <m:chr m:val="̃"/>
                   <m:ctrlPr>
                     <w:rPr>
-                      <w:rFonts w:ascii="Cambria Math" w:hAnsi="Cambria Math"/>
+                      <w:rFonts w:ascii="Times New Roman" w:hAnsi="Times New Roman" w:eastAsia="Times New Roman" w:cs="Times New Roman"/>
                     </w:rPr>
                   </m:ctrlPr>
                 </m:accPr>
@@ -1247,7 +1108,7 @@
             <m:sSubPr>
               <m:ctrlPr>
                 <w:rPr>
-                  <w:rFonts w:ascii="Cambria Math" w:hAnsi="Cambria Math"/>
+                  <w:rFonts w:ascii="Times New Roman" w:hAnsi="Times New Roman" w:eastAsia="Times New Roman" w:cs="Times New Roman"/>
                 </w:rPr>
               </m:ctrlPr>
             </m:sSubPr>
@@ -1256,7 +1117,7 @@
                 <m:accPr>
                   <m:ctrlPr>
                     <w:rPr>
-                      <w:rFonts w:ascii="Cambria Math" w:hAnsi="Cambria Math"/>
+                      <w:rFonts w:ascii="Times New Roman" w:hAnsi="Times New Roman" w:eastAsia="Times New Roman" w:cs="Times New Roman"/>
                     </w:rPr>
                   </m:ctrlPr>
                 </m:accPr>
@@ -1292,7 +1153,7 @@
             <m:sSubPr>
               <m:ctrlPr>
                 <w:rPr>
-                  <w:rFonts w:ascii="Cambria Math" w:hAnsi="Cambria Math"/>
+                  <w:rFonts w:ascii="Times New Roman" w:hAnsi="Times New Roman" w:eastAsia="Times New Roman" w:cs="Times New Roman"/>
                 </w:rPr>
               </m:ctrlPr>
             </m:sSubPr>
@@ -1328,7 +1189,7 @@
     <w:p>
       <w:pPr>
         <w:rPr>
-          <w:rFonts w:ascii="Times New Roman Bold" w:hAnsi="Times New Roman Bold" w:cs="Times New Roman Bold"/>
+          <w:rFonts w:ascii="Times New Roman" w:hAnsi="Times New Roman" w:cs="Times New Roman" w:eastAsia="Times New Roman"/>
           <w:b/>
           <w:bCs/>
         </w:rPr>
@@ -1344,14 +1205,14 @@
     <w:p>
       <w:pPr>
         <w:rPr>
-          <w:rFonts w:ascii="Times New Roman Regular" w:hAnsi="Times New Roman Regular" w:cs="Times New Roman Regular"/>
-        </w:rPr>
-      </w:pPr>
-    </w:p>
-    <w:p>
-      <w:pPr>
-        <w:rPr>
-          <w:rFonts w:ascii="Times New Roman Bold" w:hAnsi="Times New Roman Bold" w:cs="Times New Roman Bold"/>
+          <w:rFonts w:ascii="Times New Roman" w:hAnsi="Times New Roman" w:cs="Times New Roman" w:eastAsia="Times New Roman"/>
+        </w:rPr>
+      </w:pPr>
+    </w:p>
+    <w:p>
+      <w:pPr>
+        <w:rPr>
+          <w:rFonts w:ascii="Times New Roman" w:hAnsi="Times New Roman" w:cs="Times New Roman" w:eastAsia="Times New Roman"/>
           <w:b/>
           <w:bCs/>
         </w:rPr>
@@ -1368,7 +1229,7 @@
     <w:p>
       <w:pPr>
         <w:rPr>
-          <w:rFonts w:ascii="Times New Roman Bold" w:hAnsi="Times New Roman Bold" w:cs="Times New Roman Bold"/>
+          <w:rFonts w:ascii="Times New Roman" w:hAnsi="Times New Roman" w:cs="Times New Roman" w:eastAsia="Times New Roman"/>
           <w:b/>
           <w:bCs/>
         </w:rPr>
@@ -1385,24 +1246,20 @@
     <w:p>
       <w:pPr>
         <w:rPr>
-          <w:rFonts w:ascii="Times New Roman Bold" w:hAnsi="Times New Roman Bold" w:cs="Times New Roman Bold"/>
-          <w:b/>
-          <w:bCs/>
-        </w:rPr>
-      </w:pPr>
-      <w:r>
-        <w:rPr>
-          <w:rFonts w:ascii="Times New Roman" w:eastAsia="Times New Roman" w:hAnsi="Times New Roman" w:cs="Times New Roman"/>
-          <w:szCs w:val="21"/>
-        </w:rPr>
-        <w:t>Indices are warehouse i, category c, customer region r, and week t. Decision q is replenishment, x is planned fulfillment, I is ending inventory, and u is planned shortage. Parameters p, h, pi, and c-bar represent procurement, holding, shortage, and risk-adjusted route costs. The objective is:</w:t>
+          <w:rFonts w:ascii="Times New Roman" w:hAnsi="Times New Roman" w:cs="Times New Roman" w:eastAsia="Times New Roman"/>
+          <w:b/>
+          <w:bCs/>
+        </w:rPr>
+      </w:pPr>
+      <w:r>
+        <w:t>Stage A is a four-week multi-period inventory-replenishment MILP. Indices are proxy hub i, category c, customer region r, and week t. Decision q is replenishment, x is planned fulfillment, I is ending inventory, and u is planned shortage. Parameters p, h, pi, and c-bar represent procurement, holding, shortage, and risk-adjusted route costs. Replenishment ordered in week t arrives after the scenario lead time. The objective is:</w:t>
       </w:r>
     </w:p>
     <w:p>
       <w:pPr>
         <w:jc w:val="center"/>
         <w:rPr>
-          <w:rFonts w:ascii="Times New Roman Bold" w:hAnsi="Times New Roman Bold" w:cs="Times New Roman Bold"/>
+          <w:rFonts w:ascii="Times New Roman" w:hAnsi="Times New Roman" w:cs="Times New Roman" w:eastAsia="Times New Roman"/>
           <w:b/>
           <w:bCs/>
         </w:rPr>
@@ -1423,7 +1280,7 @@
             <m:sSubPr>
               <m:ctrlPr>
                 <w:rPr>
-                  <w:rFonts w:ascii="Cambria Math" w:hAnsi="Cambria Math"/>
+                  <w:rFonts w:ascii="Times New Roman" w:hAnsi="Times New Roman" w:eastAsia="Times New Roman" w:cs="Times New Roman"/>
                 </w:rPr>
               </m:ctrlPr>
             </m:sSubPr>
@@ -1461,7 +1318,7 @@
               <m:supHide m:val="1"/>
               <m:ctrlPr>
                 <w:rPr>
-                  <w:rFonts w:ascii="Cambria Math" w:hAnsi="Cambria Math"/>
+                  <w:rFonts w:ascii="Times New Roman" w:hAnsi="Times New Roman" w:eastAsia="Times New Roman" w:cs="Times New Roman"/>
                 </w:rPr>
               </m:ctrlPr>
             </m:naryPr>
@@ -1480,7 +1337,7 @@
                 <m:sSubPr>
                   <m:ctrlPr>
                     <w:rPr>
-                      <w:rFonts w:ascii="Cambria Math" w:hAnsi="Cambria Math"/>
+                      <w:rFonts w:ascii="Times New Roman" w:hAnsi="Times New Roman" w:eastAsia="Times New Roman" w:cs="Times New Roman"/>
                     </w:rPr>
                   </m:ctrlPr>
                 </m:sSubPr>
@@ -1509,7 +1366,7 @@
             <m:sSubPr>
               <m:ctrlPr>
                 <w:rPr>
-                  <w:rFonts w:ascii="Cambria Math" w:hAnsi="Cambria Math"/>
+                  <w:rFonts w:ascii="Times New Roman" w:hAnsi="Times New Roman" w:eastAsia="Times New Roman" w:cs="Times New Roman"/>
                 </w:rPr>
               </m:ctrlPr>
             </m:sSubPr>
@@ -1547,7 +1404,7 @@
               <m:supHide m:val="1"/>
               <m:ctrlPr>
                 <w:rPr>
-                  <w:rFonts w:ascii="Cambria Math" w:hAnsi="Cambria Math"/>
+                  <w:rFonts w:ascii="Times New Roman" w:hAnsi="Times New Roman" w:eastAsia="Times New Roman" w:cs="Times New Roman"/>
                 </w:rPr>
               </m:ctrlPr>
             </m:naryPr>
@@ -1566,7 +1423,7 @@
                 <m:sSubPr>
                   <m:ctrlPr>
                     <w:rPr>
-                      <w:rFonts w:ascii="Cambria Math" w:hAnsi="Cambria Math"/>
+                      <w:rFonts w:ascii="Times New Roman" w:hAnsi="Times New Roman" w:eastAsia="Times New Roman" w:cs="Times New Roman"/>
                     </w:rPr>
                   </m:ctrlPr>
                 </m:sSubPr>
@@ -1576,7 +1433,7 @@
                       <m:chr m:val="̅"/>
                       <m:ctrlPr>
                         <w:rPr>
-                          <w:rFonts w:ascii="Cambria Math" w:hAnsi="Cambria Math"/>
+                          <w:rFonts w:ascii="Times New Roman" w:hAnsi="Times New Roman" w:eastAsia="Times New Roman" w:cs="Times New Roman"/>
                         </w:rPr>
                       </m:ctrlPr>
                     </m:accPr>
@@ -1607,7 +1464,7 @@
             <m:sSubPr>
               <m:ctrlPr>
                 <w:rPr>
-                  <w:rFonts w:ascii="Cambria Math" w:hAnsi="Cambria Math"/>
+                  <w:rFonts w:ascii="Times New Roman" w:hAnsi="Times New Roman" w:eastAsia="Times New Roman" w:cs="Times New Roman"/>
                 </w:rPr>
               </m:ctrlPr>
             </m:sSubPr>
@@ -1645,7 +1502,7 @@
               <m:supHide m:val="1"/>
               <m:ctrlPr>
                 <w:rPr>
-                  <w:rFonts w:ascii="Cambria Math" w:hAnsi="Cambria Math"/>
+                  <w:rFonts w:ascii="Times New Roman" w:hAnsi="Times New Roman" w:eastAsia="Times New Roman" w:cs="Times New Roman"/>
                 </w:rPr>
               </m:ctrlPr>
             </m:naryPr>
@@ -1664,7 +1521,7 @@
                 <m:sSubPr>
                   <m:ctrlPr>
                     <w:rPr>
-                      <w:rFonts w:ascii="Cambria Math" w:hAnsi="Cambria Math"/>
+                      <w:rFonts w:ascii="Times New Roman" w:hAnsi="Times New Roman" w:eastAsia="Times New Roman" w:cs="Times New Roman"/>
                     </w:rPr>
                   </m:ctrlPr>
                 </m:sSubPr>
@@ -1693,7 +1550,7 @@
             <m:sSubPr>
               <m:ctrlPr>
                 <w:rPr>
-                  <w:rFonts w:ascii="Cambria Math" w:hAnsi="Cambria Math"/>
+                  <w:rFonts w:ascii="Times New Roman" w:hAnsi="Times New Roman" w:eastAsia="Times New Roman" w:cs="Times New Roman"/>
                 </w:rPr>
               </m:ctrlPr>
             </m:sSubPr>
@@ -1731,7 +1588,7 @@
               <m:supHide m:val="1"/>
               <m:ctrlPr>
                 <w:rPr>
-                  <w:rFonts w:ascii="Cambria Math" w:hAnsi="Cambria Math"/>
+                  <w:rFonts w:ascii="Times New Roman" w:hAnsi="Times New Roman" w:eastAsia="Times New Roman" w:cs="Times New Roman"/>
                 </w:rPr>
               </m:ctrlPr>
             </m:naryPr>
@@ -1750,7 +1607,7 @@
                 <m:sSubPr>
                   <m:ctrlPr>
                     <w:rPr>
-                      <w:rFonts w:ascii="Cambria Math" w:hAnsi="Cambria Math"/>
+                      <w:rFonts w:ascii="Times New Roman" w:hAnsi="Times New Roman" w:eastAsia="Times New Roman" w:cs="Times New Roman"/>
                     </w:rPr>
                   </m:ctrlPr>
                 </m:sSubPr>
@@ -1779,7 +1636,7 @@
             <m:sSubPr>
               <m:ctrlPr>
                 <w:rPr>
-                  <w:rFonts w:ascii="Cambria Math" w:hAnsi="Cambria Math"/>
+                  <w:rFonts w:ascii="Times New Roman" w:hAnsi="Times New Roman" w:eastAsia="Times New Roman" w:cs="Times New Roman"/>
                 </w:rPr>
               </m:ctrlPr>
             </m:sSubPr>
@@ -1817,7 +1674,7 @@
               <m:supHide m:val="1"/>
               <m:ctrlPr>
                 <w:rPr>
-                  <w:rFonts w:ascii="Cambria Math" w:hAnsi="Cambria Math"/>
+                  <w:rFonts w:ascii="Times New Roman" w:hAnsi="Times New Roman" w:eastAsia="Times New Roman" w:cs="Times New Roman"/>
                 </w:rPr>
               </m:ctrlPr>
             </m:naryPr>
@@ -1836,7 +1693,7 @@
                 <m:sSubPr>
                   <m:ctrlPr>
                     <w:rPr>
-                      <w:rFonts w:ascii="Cambria Math" w:hAnsi="Cambria Math"/>
+                      <w:rFonts w:ascii="Times New Roman" w:hAnsi="Times New Roman" w:eastAsia="Times New Roman" w:cs="Times New Roman"/>
                     </w:rPr>
                   </m:ctrlPr>
                 </m:sSubPr>
@@ -1867,7 +1724,7 @@
     <w:p>
       <w:pPr>
         <w:rPr>
-          <w:rFonts w:ascii="Times New Roman Bold" w:hAnsi="Times New Roman Bold" w:cs="Times New Roman Bold"/>
+          <w:rFonts w:ascii="Times New Roman" w:hAnsi="Times New Roman" w:cs="Times New Roman" w:eastAsia="Times New Roman"/>
           <w:b/>
           <w:bCs/>
         </w:rPr>
@@ -1884,7 +1741,7 @@
       <w:pPr>
         <w:jc w:val="center"/>
         <w:rPr>
-          <w:rFonts w:ascii="Times New Roman Bold" w:hAnsi="Times New Roman Bold" w:cs="Times New Roman Bold"/>
+          <w:rFonts w:ascii="Times New Roman" w:hAnsi="Times New Roman" w:cs="Times New Roman" w:eastAsia="Times New Roman"/>
           <w:b/>
           <w:bCs/>
         </w:rPr>
@@ -1895,7 +1752,7 @@
             <m:sSubPr>
               <m:ctrlPr>
                 <w:rPr>
-                  <w:rFonts w:ascii="Cambria Math" w:hAnsi="Cambria Math"/>
+                  <w:rFonts w:ascii="Times New Roman" w:hAnsi="Times New Roman" w:eastAsia="Times New Roman" w:cs="Times New Roman"/>
                 </w:rPr>
               </m:ctrlPr>
             </m:sSubPr>
@@ -1929,7 +1786,7 @@
             <m:sSubPr>
               <m:ctrlPr>
                 <w:rPr>
-                  <w:rFonts w:ascii="Cambria Math" w:hAnsi="Cambria Math"/>
+                  <w:rFonts w:ascii="Times New Roman" w:hAnsi="Times New Roman" w:eastAsia="Times New Roman" w:cs="Times New Roman"/>
                 </w:rPr>
               </m:ctrlPr>
             </m:sSubPr>
@@ -1963,7 +1820,7 @@
             <m:sSubPr>
               <m:ctrlPr>
                 <w:rPr>
-                  <w:rFonts w:ascii="Cambria Math" w:hAnsi="Cambria Math"/>
+                  <w:rFonts w:ascii="Times New Roman" w:hAnsi="Times New Roman" w:eastAsia="Times New Roman" w:cs="Times New Roman"/>
                 </w:rPr>
               </m:ctrlPr>
             </m:sSubPr>
@@ -1988,7 +1845,7 @@
                 <m:sSubPr>
                   <m:ctrlPr>
                     <w:rPr>
-                      <w:rFonts w:ascii="Cambria Math" w:hAnsi="Cambria Math"/>
+                      <w:rFonts w:ascii="Times New Roman" w:hAnsi="Times New Roman" w:eastAsia="Times New Roman" w:cs="Times New Roman"/>
                     </w:rPr>
                   </m:ctrlPr>
                 </m:sSubPr>
@@ -2028,7 +1885,7 @@
               <m:supHide m:val="1"/>
               <m:ctrlPr>
                 <w:rPr>
-                  <w:rFonts w:ascii="Cambria Math" w:hAnsi="Cambria Math"/>
+                  <w:rFonts w:ascii="Times New Roman" w:hAnsi="Times New Roman" w:eastAsia="Times New Roman" w:cs="Times New Roman"/>
                 </w:rPr>
               </m:ctrlPr>
             </m:naryPr>
@@ -2047,7 +1904,7 @@
                 <m:sSubPr>
                   <m:ctrlPr>
                     <w:rPr>
-                      <w:rFonts w:ascii="Cambria Math" w:hAnsi="Cambria Math"/>
+                      <w:rFonts w:ascii="Times New Roman" w:hAnsi="Times New Roman" w:eastAsia="Times New Roman" w:cs="Times New Roman"/>
                     </w:rPr>
                   </m:ctrlPr>
                 </m:sSubPr>
@@ -2079,7 +1936,7 @@
       <w:pPr>
         <w:jc w:val="center"/>
         <w:rPr>
-          <w:rFonts w:ascii="Times New Roman Bold" w:hAnsi="Times New Roman Bold" w:cs="Times New Roman Bold"/>
+          <w:rFonts w:ascii="Times New Roman" w:hAnsi="Times New Roman" w:cs="Times New Roman" w:eastAsia="Times New Roman"/>
           <w:b/>
           <w:bCs/>
         </w:rPr>
@@ -2094,7 +1951,7 @@
               <m:supHide m:val="1"/>
               <m:ctrlPr>
                 <w:rPr>
-                  <w:rFonts w:ascii="Cambria Math" w:hAnsi="Cambria Math"/>
+                  <w:rFonts w:ascii="Times New Roman" w:hAnsi="Times New Roman" w:eastAsia="Times New Roman" w:cs="Times New Roman"/>
                 </w:rPr>
               </m:ctrlPr>
             </m:naryPr>
@@ -2113,7 +1970,7 @@
                 <m:sSubPr>
                   <m:ctrlPr>
                     <w:rPr>
-                      <w:rFonts w:ascii="Cambria Math" w:hAnsi="Cambria Math"/>
+                      <w:rFonts w:ascii="Times New Roman" w:hAnsi="Times New Roman" w:eastAsia="Times New Roman" w:cs="Times New Roman"/>
                     </w:rPr>
                   </m:ctrlPr>
                 </m:sSubPr>
@@ -2149,7 +2006,7 @@
             <m:sSubPr>
               <m:ctrlPr>
                 <w:rPr>
-                  <w:rFonts w:ascii="Cambria Math" w:hAnsi="Cambria Math"/>
+                  <w:rFonts w:ascii="Times New Roman" w:hAnsi="Times New Roman" w:eastAsia="Times New Roman" w:cs="Times New Roman"/>
                 </w:rPr>
               </m:ctrlPr>
             </m:sSubPr>
@@ -2183,7 +2040,7 @@
             <m:sSubPr>
               <m:ctrlPr>
                 <w:rPr>
-                  <w:rFonts w:ascii="Cambria Math" w:hAnsi="Cambria Math"/>
+                  <w:rFonts w:ascii="Times New Roman" w:hAnsi="Times New Roman" w:eastAsia="Times New Roman" w:cs="Times New Roman"/>
                 </w:rPr>
               </m:ctrlPr>
             </m:sSubPr>
@@ -2193,7 +2050,7 @@
                   <m:chr m:val="̃"/>
                   <m:ctrlPr>
                     <w:rPr>
-                      <w:rFonts w:ascii="Cambria Math" w:hAnsi="Cambria Math"/>
+                      <w:rFonts w:ascii="Times New Roman" w:hAnsi="Times New Roman" w:eastAsia="Times New Roman" w:cs="Times New Roman"/>
                     </w:rPr>
                   </m:ctrlPr>
                 </m:accPr>
@@ -2224,7 +2081,7 @@
     <w:p>
       <w:pPr>
         <w:rPr>
-          <w:rFonts w:ascii="Times New Roman Bold" w:hAnsi="Times New Roman Bold" w:cs="Times New Roman Bold"/>
+          <w:rFonts w:ascii="Times New Roman" w:hAnsi="Times New Roman" w:cs="Times New Roman" w:eastAsia="Times New Roman"/>
           <w:b/>
           <w:bCs/>
         </w:rPr>
@@ -2241,7 +2098,7 @@
       <w:pPr>
         <w:jc w:val="center"/>
         <w:rPr>
-          <w:rFonts w:ascii="Times New Roman Bold" w:hAnsi="Times New Roman Bold" w:cs="Times New Roman Bold"/>
+          <w:rFonts w:ascii="Times New Roman" w:hAnsi="Times New Roman" w:cs="Times New Roman" w:eastAsia="Times New Roman"/>
           <w:b/>
           <w:bCs/>
         </w:rPr>
@@ -2256,7 +2113,7 @@
               <m:supHide m:val="1"/>
               <m:ctrlPr>
                 <w:rPr>
-                  <w:rFonts w:ascii="Cambria Math" w:hAnsi="Cambria Math"/>
+                  <w:rFonts w:ascii="Times New Roman" w:hAnsi="Times New Roman" w:eastAsia="Times New Roman" w:cs="Times New Roman"/>
                 </w:rPr>
               </m:ctrlPr>
             </m:naryPr>
@@ -2275,7 +2132,7 @@
                 <m:sSubPr>
                   <m:ctrlPr>
                     <w:rPr>
-                      <w:rFonts w:ascii="Cambria Math" w:hAnsi="Cambria Math"/>
+                      <w:rFonts w:ascii="Times New Roman" w:hAnsi="Times New Roman" w:eastAsia="Times New Roman" w:cs="Times New Roman"/>
                     </w:rPr>
                   </m:ctrlPr>
                 </m:sSubPr>
@@ -2304,7 +2161,7 @@
             <m:sSubPr>
               <m:ctrlPr>
                 <w:rPr>
-                  <w:rFonts w:ascii="Cambria Math" w:hAnsi="Cambria Math"/>
+                  <w:rFonts w:ascii="Times New Roman" w:hAnsi="Times New Roman" w:eastAsia="Times New Roman" w:cs="Times New Roman"/>
                 </w:rPr>
               </m:ctrlPr>
             </m:sSubPr>
@@ -2338,7 +2195,7 @@
             <m:sSubPr>
               <m:ctrlPr>
                 <w:rPr>
-                  <w:rFonts w:ascii="Cambria Math" w:hAnsi="Cambria Math"/>
+                  <w:rFonts w:ascii="Times New Roman" w:hAnsi="Times New Roman" w:eastAsia="Times New Roman" w:cs="Times New Roman"/>
                 </w:rPr>
               </m:ctrlPr>
             </m:sSubPr>
@@ -2368,7 +2225,7 @@
       <w:pPr>
         <w:jc w:val="center"/>
         <w:rPr>
-          <w:rFonts w:ascii="Times New Roman Bold" w:hAnsi="Times New Roman Bold" w:cs="Times New Roman Bold"/>
+          <w:rFonts w:ascii="Times New Roman" w:hAnsi="Times New Roman" w:cs="Times New Roman" w:eastAsia="Times New Roman"/>
           <w:b/>
           <w:bCs/>
         </w:rPr>
@@ -2383,7 +2240,7 @@
               <m:supHide m:val="1"/>
               <m:ctrlPr>
                 <w:rPr>
-                  <w:rFonts w:ascii="Cambria Math" w:hAnsi="Cambria Math"/>
+                  <w:rFonts w:ascii="Times New Roman" w:hAnsi="Times New Roman" w:eastAsia="Times New Roman" w:cs="Times New Roman"/>
                 </w:rPr>
               </m:ctrlPr>
             </m:naryPr>
@@ -2402,7 +2259,7 @@
                 <m:sSubPr>
                   <m:ctrlPr>
                     <w:rPr>
-                      <w:rFonts w:ascii="Cambria Math" w:hAnsi="Cambria Math"/>
+                      <w:rFonts w:ascii="Times New Roman" w:hAnsi="Times New Roman" w:eastAsia="Times New Roman" w:cs="Times New Roman"/>
                     </w:rPr>
                   </m:ctrlPr>
                 </m:sSubPr>
@@ -2438,7 +2295,7 @@
             <m:sSubPr>
               <m:ctrlPr>
                 <w:rPr>
-                  <w:rFonts w:ascii="Cambria Math" w:hAnsi="Cambria Math"/>
+                  <w:rFonts w:ascii="Times New Roman" w:hAnsi="Times New Roman" w:eastAsia="Times New Roman" w:cs="Times New Roman"/>
                 </w:rPr>
               </m:ctrlPr>
             </m:sSubPr>
@@ -2467,7 +2324,7 @@
     <w:p>
       <w:pPr>
         <w:rPr>
-          <w:rFonts w:ascii="Times New Roman Bold" w:hAnsi="Times New Roman Bold" w:cs="Times New Roman Bold"/>
+          <w:rFonts w:ascii="Times New Roman" w:hAnsi="Times New Roman" w:cs="Times New Roman" w:eastAsia="Times New Roman"/>
           <w:b/>
           <w:bCs/>
         </w:rPr>
@@ -2484,7 +2341,7 @@
       <w:pPr>
         <w:jc w:val="center"/>
         <w:rPr>
-          <w:rFonts w:ascii="Times New Roman Bold" w:hAnsi="Times New Roman Bold" w:cs="Times New Roman Bold"/>
+          <w:rFonts w:ascii="Times New Roman" w:hAnsi="Times New Roman" w:cs="Times New Roman" w:eastAsia="Times New Roman"/>
           <w:b/>
           <w:bCs/>
         </w:rPr>
@@ -2499,7 +2356,7 @@
               <m:supHide m:val="1"/>
               <m:ctrlPr>
                 <w:rPr>
-                  <w:rFonts w:ascii="Cambria Math" w:hAnsi="Cambria Math"/>
+                  <w:rFonts w:ascii="Times New Roman" w:hAnsi="Times New Roman" w:eastAsia="Times New Roman" w:cs="Times New Roman"/>
                 </w:rPr>
               </m:ctrlPr>
             </m:naryPr>
@@ -2518,7 +2375,7 @@
                 <m:sSubPr>
                   <m:ctrlPr>
                     <w:rPr>
-                      <w:rFonts w:ascii="Cambria Math" w:hAnsi="Cambria Math"/>
+                      <w:rFonts w:ascii="Times New Roman" w:hAnsi="Times New Roman" w:eastAsia="Times New Roman" w:cs="Times New Roman"/>
                     </w:rPr>
                   </m:ctrlPr>
                 </m:sSubPr>
@@ -2554,7 +2411,7 @@
             <m:sSubPr>
               <m:ctrlPr>
                 <w:rPr>
-                  <w:rFonts w:ascii="Cambria Math" w:hAnsi="Cambria Math"/>
+                  <w:rFonts w:ascii="Times New Roman" w:hAnsi="Times New Roman" w:eastAsia="Times New Roman" w:cs="Times New Roman"/>
                 </w:rPr>
               </m:ctrlPr>
             </m:sSubPr>
@@ -2592,7 +2449,7 @@
               <m:supHide m:val="1"/>
               <m:ctrlPr>
                 <w:rPr>
-                  <w:rFonts w:ascii="Cambria Math" w:hAnsi="Cambria Math"/>
+                  <w:rFonts w:ascii="Times New Roman" w:hAnsi="Times New Roman" w:eastAsia="Times New Roman" w:cs="Times New Roman"/>
                 </w:rPr>
               </m:ctrlPr>
             </m:naryPr>
@@ -2611,7 +2468,7 @@
                 <m:sSubPr>
                   <m:ctrlPr>
                     <w:rPr>
-                      <w:rFonts w:ascii="Cambria Math" w:hAnsi="Cambria Math"/>
+                      <w:rFonts w:ascii="Times New Roman" w:hAnsi="Times New Roman" w:eastAsia="Times New Roman" w:cs="Times New Roman"/>
                     </w:rPr>
                   </m:ctrlPr>
                 </m:sSubPr>
@@ -2621,7 +2478,7 @@
                       <m:chr m:val="̃"/>
                       <m:ctrlPr>
                         <w:rPr>
-                          <w:rFonts w:ascii="Cambria Math" w:hAnsi="Cambria Math"/>
+                          <w:rFonts w:ascii="Times New Roman" w:hAnsi="Times New Roman" w:eastAsia="Times New Roman" w:cs="Times New Roman"/>
                         </w:rPr>
                       </m:ctrlPr>
                     </m:accPr>
@@ -2654,7 +2511,7 @@
     <w:p>
       <w:pPr>
         <w:rPr>
-          <w:rFonts w:ascii="Times New Roman Bold" w:hAnsi="Times New Roman Bold" w:cs="Times New Roman Bold"/>
+          <w:rFonts w:ascii="Times New Roman" w:hAnsi="Times New Roman" w:cs="Times New Roman" w:eastAsia="Times New Roman"/>
           <w:b/>
           <w:bCs/>
         </w:rPr>
@@ -2671,32 +2528,20 @@
     <w:p>
       <w:pPr>
         <w:rPr>
-          <w:rFonts w:ascii="Times New Roman Bold" w:hAnsi="Times New Roman Bold" w:cs="Times New Roman Bold"/>
-          <w:b/>
-          <w:bCs/>
-        </w:rPr>
-      </w:pPr>
-      <w:r>
-        <w:rPr>
-          <w:rFonts w:ascii="Times New Roman" w:eastAsia="Times New Roman" w:hAnsi="Times New Roman" w:cs="Times New Roman"/>
-          <w:szCs w:val="21"/>
-        </w:rPr>
-        <w:t xml:space="preserve">After actual demand is revealed, y allocates available inventory and v records unmet or delayed demand. The risk-adjusted route cost includes observed median freight, predicted late-delivery </w:t>
-      </w:r>
-      <w:r>
-        <w:rPr>
-          <w:rFonts w:ascii="Times New Roman" w:eastAsia="Times New Roman" w:hAnsi="Times New Roman" w:cs="Times New Roman"/>
-          <w:szCs w:val="21"/>
-        </w:rPr>
-        <w:lastRenderedPageBreak/>
-        <w:t>exposure, and seller-risk exposure; no separate handling-cost term is introduced because Olist does not observe it.</w:t>
+          <w:rFonts w:ascii="Times New Roman" w:hAnsi="Times New Roman" w:cs="Times New Roman" w:eastAsia="Times New Roman"/>
+          <w:b/>
+          <w:bCs/>
+        </w:rPr>
+      </w:pPr>
+      <w:r>
+        <w:t>Stage B is a capacitated transportation/fulfillment MILP. After actual demand is revealed, y allocates available inventory and v records unmet or delayed demand. Risk-adjusted route cost combines observed median freight with smoothed late-delivery and seller late-dispatch rates computed only from history available before the decision week. No handling-cost term is introduced because Olist does not observe one.</w:t>
       </w:r>
     </w:p>
     <w:p>
       <w:pPr>
         <w:jc w:val="center"/>
         <w:rPr>
-          <w:rFonts w:ascii="Times New Roman Bold" w:hAnsi="Times New Roman Bold" w:cs="Times New Roman Bold"/>
+          <w:rFonts w:ascii="Times New Roman" w:hAnsi="Times New Roman" w:cs="Times New Roman" w:eastAsia="Times New Roman"/>
           <w:b/>
           <w:bCs/>
         </w:rPr>
@@ -2717,7 +2562,7 @@
             <m:sSubPr>
               <m:ctrlPr>
                 <w:rPr>
-                  <w:rFonts w:ascii="Cambria Math" w:hAnsi="Cambria Math"/>
+                  <w:rFonts w:ascii="Times New Roman" w:hAnsi="Times New Roman" w:eastAsia="Times New Roman" w:cs="Times New Roman"/>
                 </w:rPr>
               </m:ctrlPr>
             </m:sSubPr>
@@ -2755,7 +2600,7 @@
               <m:supHide m:val="1"/>
               <m:ctrlPr>
                 <w:rPr>
-                  <w:rFonts w:ascii="Cambria Math" w:hAnsi="Cambria Math"/>
+                  <w:rFonts w:ascii="Times New Roman" w:hAnsi="Times New Roman" w:eastAsia="Times New Roman" w:cs="Times New Roman"/>
                 </w:rPr>
               </m:ctrlPr>
             </m:naryPr>
@@ -2774,7 +2619,7 @@
                 <m:sSubPr>
                   <m:ctrlPr>
                     <w:rPr>
-                      <w:rFonts w:ascii="Cambria Math" w:hAnsi="Cambria Math"/>
+                      <w:rFonts w:ascii="Times New Roman" w:hAnsi="Times New Roman" w:eastAsia="Times New Roman" w:cs="Times New Roman"/>
                     </w:rPr>
                   </m:ctrlPr>
                 </m:sSubPr>
@@ -2784,7 +2629,7 @@
                       <m:chr m:val="̅"/>
                       <m:ctrlPr>
                         <w:rPr>
-                          <w:rFonts w:ascii="Cambria Math" w:hAnsi="Cambria Math"/>
+                          <w:rFonts w:ascii="Times New Roman" w:hAnsi="Times New Roman" w:eastAsia="Times New Roman" w:cs="Times New Roman"/>
                         </w:rPr>
                       </m:ctrlPr>
                     </m:accPr>
@@ -2815,7 +2660,7 @@
             <m:sSubPr>
               <m:ctrlPr>
                 <w:rPr>
-                  <w:rFonts w:ascii="Cambria Math" w:hAnsi="Cambria Math"/>
+                  <w:rFonts w:ascii="Times New Roman" w:hAnsi="Times New Roman" w:eastAsia="Times New Roman" w:cs="Times New Roman"/>
                 </w:rPr>
               </m:ctrlPr>
             </m:sSubPr>
@@ -2853,7 +2698,7 @@
               <m:supHide m:val="1"/>
               <m:ctrlPr>
                 <w:rPr>
-                  <w:rFonts w:ascii="Cambria Math" w:hAnsi="Cambria Math"/>
+                  <w:rFonts w:ascii="Times New Roman" w:hAnsi="Times New Roman" w:eastAsia="Times New Roman" w:cs="Times New Roman"/>
                 </w:rPr>
               </m:ctrlPr>
             </m:naryPr>
@@ -2872,7 +2717,7 @@
                 <m:sSubPr>
                   <m:ctrlPr>
                     <w:rPr>
-                      <w:rFonts w:ascii="Cambria Math" w:hAnsi="Cambria Math"/>
+                      <w:rFonts w:ascii="Times New Roman" w:hAnsi="Times New Roman" w:eastAsia="Times New Roman" w:cs="Times New Roman"/>
                     </w:rPr>
                   </m:ctrlPr>
                 </m:sSubPr>
@@ -2901,7 +2746,7 @@
             <m:sSubPr>
               <m:ctrlPr>
                 <w:rPr>
-                  <w:rFonts w:ascii="Cambria Math" w:hAnsi="Cambria Math"/>
+                  <w:rFonts w:ascii="Times New Roman" w:hAnsi="Times New Roman" w:eastAsia="Times New Roman" w:cs="Times New Roman"/>
                 </w:rPr>
               </m:ctrlPr>
             </m:sSubPr>
@@ -2931,7 +2776,7 @@
       <w:pPr>
         <w:jc w:val="center"/>
         <w:rPr>
-          <w:rFonts w:ascii="Times New Roman Bold" w:hAnsi="Times New Roman Bold" w:cs="Times New Roman Bold"/>
+          <w:rFonts w:ascii="Times New Roman" w:hAnsi="Times New Roman" w:cs="Times New Roman" w:eastAsia="Times New Roman"/>
           <w:b/>
           <w:bCs/>
         </w:rPr>
@@ -2942,7 +2787,7 @@
             <m:sSubPr>
               <m:ctrlPr>
                 <w:rPr>
-                  <w:rFonts w:ascii="Cambria Math" w:hAnsi="Cambria Math"/>
+                  <w:rFonts w:ascii="Times New Roman" w:hAnsi="Times New Roman" w:eastAsia="Times New Roman" w:cs="Times New Roman"/>
                 </w:rPr>
               </m:ctrlPr>
             </m:sSubPr>
@@ -2952,7 +2797,7 @@
                   <m:chr m:val="̅"/>
                   <m:ctrlPr>
                     <w:rPr>
-                      <w:rFonts w:ascii="Cambria Math" w:hAnsi="Cambria Math"/>
+                      <w:rFonts w:ascii="Times New Roman" w:hAnsi="Times New Roman" w:eastAsia="Times New Roman" w:cs="Times New Roman"/>
                     </w:rPr>
                   </m:ctrlPr>
                 </m:accPr>
@@ -2988,7 +2833,7 @@
             <m:sSubPr>
               <m:ctrlPr>
                 <w:rPr>
-                  <w:rFonts w:ascii="Cambria Math" w:hAnsi="Cambria Math"/>
+                  <w:rFonts w:ascii="Times New Roman" w:hAnsi="Times New Roman" w:eastAsia="Times New Roman" w:cs="Times New Roman"/>
                 </w:rPr>
               </m:ctrlPr>
             </m:sSubPr>
@@ -3025,7 +2870,7 @@
             <m:sSubPr>
               <m:ctrlPr>
                 <w:rPr>
-                  <w:rFonts w:ascii="Cambria Math" w:hAnsi="Cambria Math"/>
+                  <w:rFonts w:ascii="Times New Roman" w:hAnsi="Times New Roman" w:eastAsia="Times New Roman" w:cs="Times New Roman"/>
                 </w:rPr>
               </m:ctrlPr>
             </m:sSubPr>
@@ -3055,7 +2900,7 @@
             <m:sSubPr>
               <m:ctrlPr>
                 <w:rPr>
-                  <w:rFonts w:ascii="Cambria Math" w:hAnsi="Cambria Math"/>
+                  <w:rFonts w:ascii="Times New Roman" w:hAnsi="Times New Roman" w:eastAsia="Times New Roman" w:cs="Times New Roman"/>
                 </w:rPr>
               </m:ctrlPr>
             </m:sSubPr>
@@ -3092,7 +2937,7 @@
             <m:sSubPr>
               <m:ctrlPr>
                 <w:rPr>
-                  <w:rFonts w:ascii="Cambria Math" w:hAnsi="Cambria Math"/>
+                  <w:rFonts w:ascii="Times New Roman" w:hAnsi="Times New Roman" w:eastAsia="Times New Roman" w:cs="Times New Roman"/>
                 </w:rPr>
               </m:ctrlPr>
             </m:sSubPr>
@@ -3131,7 +2976,7 @@
     <w:p>
       <w:pPr>
         <w:rPr>
-          <w:rFonts w:ascii="Times New Roman Bold" w:hAnsi="Times New Roman Bold" w:cs="Times New Roman Bold"/>
+          <w:rFonts w:ascii="Times New Roman" w:hAnsi="Times New Roman" w:cs="Times New Roman" w:eastAsia="Times New Roman"/>
           <w:b/>
           <w:bCs/>
         </w:rPr>
@@ -3148,7 +2993,7 @@
       <w:pPr>
         <w:jc w:val="center"/>
         <w:rPr>
-          <w:rFonts w:ascii="Times New Roman Bold" w:hAnsi="Times New Roman Bold" w:cs="Times New Roman Bold"/>
+          <w:rFonts w:ascii="Times New Roman" w:hAnsi="Times New Roman" w:cs="Times New Roman" w:eastAsia="Times New Roman"/>
           <w:b/>
           <w:bCs/>
         </w:rPr>
@@ -3163,7 +3008,7 @@
               <m:supHide m:val="1"/>
               <m:ctrlPr>
                 <w:rPr>
-                  <w:rFonts w:ascii="Cambria Math" w:hAnsi="Cambria Math"/>
+                  <w:rFonts w:ascii="Times New Roman" w:hAnsi="Times New Roman" w:eastAsia="Times New Roman" w:cs="Times New Roman"/>
                 </w:rPr>
               </m:ctrlPr>
             </m:naryPr>
@@ -3182,7 +3027,7 @@
                 <m:sSubPr>
                   <m:ctrlPr>
                     <w:rPr>
-                      <w:rFonts w:ascii="Cambria Math" w:hAnsi="Cambria Math"/>
+                      <w:rFonts w:ascii="Times New Roman" w:hAnsi="Times New Roman" w:eastAsia="Times New Roman" w:cs="Times New Roman"/>
                     </w:rPr>
                   </m:ctrlPr>
                 </m:sSubPr>
@@ -3218,7 +3063,7 @@
             <m:sSubPr>
               <m:ctrlPr>
                 <w:rPr>
-                  <w:rFonts w:ascii="Cambria Math" w:hAnsi="Cambria Math"/>
+                  <w:rFonts w:ascii="Times New Roman" w:hAnsi="Times New Roman" w:eastAsia="Times New Roman" w:cs="Times New Roman"/>
                 </w:rPr>
               </m:ctrlPr>
             </m:sSubPr>
@@ -3252,7 +3097,7 @@
             <m:sSubPr>
               <m:ctrlPr>
                 <w:rPr>
-                  <w:rFonts w:ascii="Cambria Math" w:hAnsi="Cambria Math"/>
+                  <w:rFonts w:ascii="Times New Roman" w:hAnsi="Times New Roman" w:eastAsia="Times New Roman" w:cs="Times New Roman"/>
                 </w:rPr>
               </m:ctrlPr>
             </m:sSubPr>
@@ -3282,7 +3127,7 @@
       <w:pPr>
         <w:jc w:val="center"/>
         <w:rPr>
-          <w:rFonts w:ascii="Times New Roman Bold" w:hAnsi="Times New Roman Bold" w:cs="Times New Roman Bold"/>
+          <w:rFonts w:ascii="Times New Roman" w:hAnsi="Times New Roman" w:cs="Times New Roman" w:eastAsia="Times New Roman"/>
           <w:b/>
           <w:bCs/>
         </w:rPr>
@@ -3297,7 +3142,7 @@
               <m:supHide m:val="1"/>
               <m:ctrlPr>
                 <w:rPr>
-                  <w:rFonts w:ascii="Cambria Math" w:hAnsi="Cambria Math"/>
+                  <w:rFonts w:ascii="Times New Roman" w:hAnsi="Times New Roman" w:eastAsia="Times New Roman" w:cs="Times New Roman"/>
                 </w:rPr>
               </m:ctrlPr>
             </m:naryPr>
@@ -3316,7 +3161,7 @@
                 <m:sSubPr>
                   <m:ctrlPr>
                     <w:rPr>
-                      <w:rFonts w:ascii="Cambria Math" w:hAnsi="Cambria Math"/>
+                      <w:rFonts w:ascii="Times New Roman" w:hAnsi="Times New Roman" w:eastAsia="Times New Roman" w:cs="Times New Roman"/>
                     </w:rPr>
                   </m:ctrlPr>
                 </m:sSubPr>
@@ -3352,7 +3197,7 @@
             <m:sSubPr>
               <m:ctrlPr>
                 <w:rPr>
-                  <w:rFonts w:ascii="Cambria Math" w:hAnsi="Cambria Math"/>
+                  <w:rFonts w:ascii="Times New Roman" w:hAnsi="Times New Roman" w:eastAsia="Times New Roman" w:cs="Times New Roman"/>
                 </w:rPr>
               </m:ctrlPr>
             </m:sSubPr>
@@ -3390,7 +3235,7 @@
               <m:supHide m:val="1"/>
               <m:ctrlPr>
                 <w:rPr>
-                  <w:rFonts w:ascii="Cambria Math" w:hAnsi="Cambria Math"/>
+                  <w:rFonts w:ascii="Times New Roman" w:hAnsi="Times New Roman" w:eastAsia="Times New Roman" w:cs="Times New Roman"/>
                 </w:rPr>
               </m:ctrlPr>
             </m:naryPr>
@@ -3409,7 +3254,7 @@
                 <m:sSubPr>
                   <m:ctrlPr>
                     <w:rPr>
-                      <w:rFonts w:ascii="Cambria Math" w:hAnsi="Cambria Math"/>
+                      <w:rFonts w:ascii="Times New Roman" w:hAnsi="Times New Roman" w:eastAsia="Times New Roman" w:cs="Times New Roman"/>
                     </w:rPr>
                   </m:ctrlPr>
                 </m:sSubPr>
@@ -3438,7 +3283,7 @@
             <m:sSubPr>
               <m:ctrlPr>
                 <w:rPr>
-                  <w:rFonts w:ascii="Cambria Math" w:hAnsi="Cambria Math"/>
+                  <w:rFonts w:ascii="Times New Roman" w:hAnsi="Times New Roman" w:eastAsia="Times New Roman" w:cs="Times New Roman"/>
                 </w:rPr>
               </m:ctrlPr>
             </m:sSubPr>
@@ -3472,7 +3317,7 @@
             <m:sSubPr>
               <m:ctrlPr>
                 <w:rPr>
-                  <w:rFonts w:ascii="Cambria Math" w:hAnsi="Cambria Math"/>
+                  <w:rFonts w:ascii="Times New Roman" w:hAnsi="Times New Roman" w:eastAsia="Times New Roman" w:cs="Times New Roman"/>
                 </w:rPr>
               </m:ctrlPr>
             </m:sSubPr>
@@ -3501,7 +3346,7 @@
     <w:p>
       <w:pPr>
         <w:rPr>
-          <w:rFonts w:ascii="Times New Roman Bold" w:hAnsi="Times New Roman Bold" w:cs="Times New Roman Bold"/>
+          <w:rFonts w:ascii="Times New Roman" w:hAnsi="Times New Roman" w:cs="Times New Roman" w:eastAsia="Times New Roman"/>
           <w:b/>
           <w:bCs/>
         </w:rPr>
@@ -3517,14 +3362,14 @@
     <w:p>
       <w:pPr>
         <w:rPr>
-          <w:rFonts w:ascii="Times New Roman Regular" w:hAnsi="Times New Roman Regular" w:cs="Times New Roman Regular"/>
-        </w:rPr>
-      </w:pPr>
-    </w:p>
-    <w:p>
-      <w:pPr>
-        <w:rPr>
-          <w:rFonts w:ascii="Times New Roman Bold" w:hAnsi="Times New Roman Bold" w:cs="Times New Roman Bold"/>
+          <w:rFonts w:ascii="Times New Roman" w:hAnsi="Times New Roman" w:cs="Times New Roman" w:eastAsia="Times New Roman"/>
+        </w:rPr>
+      </w:pPr>
+    </w:p>
+    <w:p>
+      <w:pPr>
+        <w:rPr>
+          <w:rFonts w:ascii="Times New Roman" w:hAnsi="Times New Roman" w:cs="Times New Roman" w:eastAsia="Times New Roman"/>
           <w:b/>
           <w:bCs/>
         </w:rPr>
@@ -3541,23 +3386,19 @@
     <w:p>
       <w:pPr>
         <w:rPr>
-          <w:rFonts w:ascii="Times New Roman Bold" w:hAnsi="Times New Roman Bold" w:cs="Times New Roman Bold"/>
-          <w:b/>
-          <w:bCs/>
-        </w:rPr>
-      </w:pPr>
-      <w:r>
-        <w:rPr>
-          <w:rFonts w:ascii="Times New Roman" w:eastAsia="Times New Roman" w:hAnsi="Times New Roman" w:cs="Times New Roman"/>
-          <w:szCs w:val="21"/>
-        </w:rPr>
-        <w:t>Three policies will be evaluated under identical network, cost, capacity, and service assumptions: (1) last-week demand plus OR; (2) four-week moving-average demand plus OR; and (3) pooled Ridge demand plus uncertainty adjustment and OR. A 13-week rolling historical backtest is planned. This design isolates the value of the forecasting input without changing the optimization environment between policies.</w:t>
-      </w:r>
-    </w:p>
-    <w:p>
-      <w:pPr>
-        <w:rPr>
-          <w:rFonts w:ascii="Times New Roman Bold" w:hAnsi="Times New Roman Bold" w:cs="Times New Roman Bold"/>
+          <w:rFonts w:ascii="Times New Roman" w:hAnsi="Times New Roman" w:cs="Times New Roman" w:eastAsia="Times New Roman"/>
+          <w:b/>
+          <w:bCs/>
+        </w:rPr>
+      </w:pPr>
+      <w:r>
+        <w:t>Three forecast-plus-OR policies will be evaluated under identical network, cost, capacity, and service assumptions: (1) last-week naive forecast plus OR; (2) four-week moving-average forecast plus OR; and (3) pooled Ridge forecast plus OR. All three policies use method-specific, past-only uncertainty adjustment. A 13-week rolling historical backtest will re-estimate the forecast, solve the four-week planning MILP, apply only the first replenishment decision, reveal actual demand, solve the fulfillment MILP, and update inventory. This paired design isolates forecast-input value without changing the operating environment between policies.</w:t>
+      </w:r>
+    </w:p>
+    <w:p>
+      <w:pPr>
+        <w:rPr>
+          <w:rFonts w:ascii="Times New Roman" w:hAnsi="Times New Roman" w:cs="Times New Roman" w:eastAsia="Times New Roman"/>
           <w:b/>
           <w:bCs/>
         </w:rPr>
@@ -3574,7 +3415,7 @@
       <w:pPr>
         <w:jc w:val="center"/>
         <w:rPr>
-          <w:rFonts w:ascii="Times New Roman Bold" w:hAnsi="Times New Roman Bold" w:cs="Times New Roman Bold"/>
+          <w:rFonts w:ascii="Times New Roman" w:hAnsi="Times New Roman" w:cs="Times New Roman" w:eastAsia="Times New Roman"/>
           <w:b/>
           <w:bCs/>
         </w:rPr>
@@ -3602,7 +3443,7 @@
             <m:fPr>
               <m:ctrlPr>
                 <w:rPr>
-                  <w:rFonts w:ascii="Cambria Math" w:hAnsi="Cambria Math"/>
+                  <w:rFonts w:ascii="Times New Roman" w:hAnsi="Times New Roman" w:eastAsia="Times New Roman" w:cs="Times New Roman"/>
                 </w:rPr>
               </m:ctrlPr>
             </m:fPr>
@@ -3615,7 +3456,7 @@
                   <m:supHide m:val="1"/>
                   <m:ctrlPr>
                     <w:rPr>
-                      <w:rFonts w:ascii="Cambria Math" w:hAnsi="Cambria Math"/>
+                      <w:rFonts w:ascii="Times New Roman" w:hAnsi="Times New Roman" w:eastAsia="Times New Roman" w:cs="Times New Roman"/>
                     </w:rPr>
                   </m:ctrlPr>
                 </m:naryPr>
@@ -3634,7 +3475,7 @@
                     <m:sSubPr>
                       <m:ctrlPr>
                         <w:rPr>
-                          <w:rFonts w:ascii="Cambria Math" w:hAnsi="Cambria Math"/>
+                          <w:rFonts w:ascii="Times New Roman" w:hAnsi="Times New Roman" w:eastAsia="Times New Roman" w:cs="Times New Roman"/>
                         </w:rPr>
                       </m:ctrlPr>
                     </m:sSubPr>
@@ -3669,7 +3510,7 @@
                   <m:supHide m:val="1"/>
                   <m:ctrlPr>
                     <w:rPr>
-                      <w:rFonts w:ascii="Cambria Math" w:hAnsi="Cambria Math"/>
+                      <w:rFonts w:ascii="Times New Roman" w:hAnsi="Times New Roman" w:eastAsia="Times New Roman" w:cs="Times New Roman"/>
                     </w:rPr>
                   </m:ctrlPr>
                 </m:naryPr>
@@ -3688,7 +3529,7 @@
                     <m:sSubPr>
                       <m:ctrlPr>
                         <w:rPr>
-                          <w:rFonts w:ascii="Cambria Math" w:hAnsi="Cambria Math"/>
+                          <w:rFonts w:ascii="Times New Roman" w:hAnsi="Times New Roman" w:eastAsia="Times New Roman" w:cs="Times New Roman"/>
                         </w:rPr>
                       </m:ctrlPr>
                     </m:sSubPr>
@@ -3721,30 +3562,26 @@
     <w:p>
       <w:pPr>
         <w:rPr>
-          <w:rFonts w:ascii="Times New Roman Bold" w:hAnsi="Times New Roman Bold" w:cs="Times New Roman Bold"/>
-          <w:b/>
-          <w:bCs/>
-        </w:rPr>
-      </w:pPr>
-      <w:r>
-        <w:rPr>
-          <w:rFonts w:ascii="Times New Roman" w:eastAsia="Times New Roman" w:hAnsi="Times New Roman" w:cs="Times New Roman"/>
-          <w:szCs w:val="21"/>
-        </w:rPr>
-        <w:t>Forecast metrics will include WAPE, MAE, and bias. Operational metrics will include total cost and its procurement, freight/risk, holding, shortage, and service-gap components; fill rate; shortage units; ending inventory; regional service performance; late-risk exposure; solver status; and solution time. Sensitivity tests will vary the safety multiplier, service target, capacity, lead time, shortage penalty, and risk weights.</w:t>
-      </w:r>
-    </w:p>
-    <w:p>
-      <w:pPr>
-        <w:rPr>
-          <w:rFonts w:ascii="Times New Roman Regular" w:hAnsi="Times New Roman Regular" w:cs="Times New Roman Regular"/>
-        </w:rPr>
-      </w:pPr>
-    </w:p>
-    <w:p>
-      <w:pPr>
-        <w:rPr>
-          <w:rFonts w:ascii="Times New Roman Bold" w:hAnsi="Times New Roman Bold" w:cs="Times New Roman Bold"/>
+          <w:rFonts w:ascii="Times New Roman" w:hAnsi="Times New Roman" w:cs="Times New Roman" w:eastAsia="Times New Roman"/>
+          <w:b/>
+          <w:bCs/>
+        </w:rPr>
+      </w:pPr>
+      <w:r>
+        <w:t>Forecast metrics will include WAPE, MAE, and bias. Operational metrics will include total cost and its procurement, freight/risk, holding, shortage, and service-gap components; fill rate; shortage units; ending inventory; regional service performance; late-risk exposure; solver status; and solution time. The focused sensitivity design will vary safety multiplier (0, 0.5, 1.0), service target (85%, 90%, 95%), capacity multipliers (80%, 100%, 120%), lead time (one versus two weeks), shortage penalty, and risk weights (zero, base, double). Priority will be given to the three research questions; optional extensions will be dropped if they threaten the eight-day schedule.</w:t>
+      </w:r>
+    </w:p>
+    <w:p>
+      <w:pPr>
+        <w:rPr>
+          <w:rFonts w:ascii="Times New Roman" w:hAnsi="Times New Roman" w:cs="Times New Roman" w:eastAsia="Times New Roman"/>
+        </w:rPr>
+      </w:pPr>
+    </w:p>
+    <w:p>
+      <w:pPr>
+        <w:rPr>
+          <w:rFonts w:ascii="Times New Roman" w:hAnsi="Times New Roman" w:cs="Times New Roman" w:eastAsia="Times New Roman"/>
           <w:b/>
           <w:bCs/>
         </w:rPr>
@@ -3761,7 +3598,7 @@
     <w:p>
       <w:pPr>
         <w:rPr>
-          <w:rFonts w:ascii="Times New Roman Bold" w:hAnsi="Times New Roman Bold" w:cs="Times New Roman Bold"/>
+          <w:rFonts w:ascii="Times New Roman" w:hAnsi="Times New Roman" w:cs="Times New Roman" w:eastAsia="Times New Roman"/>
           <w:b/>
           <w:bCs/>
         </w:rPr>
@@ -3777,7 +3614,7 @@
     <w:p>
       <w:pPr>
         <w:rPr>
-          <w:rFonts w:ascii="Times New Roman Regular" w:hAnsi="Times New Roman Regular" w:cs="Times New Roman Regular"/>
+          <w:rFonts w:ascii="Times New Roman" w:hAnsi="Times New Roman" w:cs="Times New Roman" w:eastAsia="Times New Roman"/>
         </w:rPr>
       </w:pPr>
       <w:r>
@@ -3791,7 +3628,7 @@
     <w:p>
       <w:pPr>
         <w:rPr>
-          <w:rFonts w:ascii="Times New Roman Regular" w:hAnsi="Times New Roman Regular" w:cs="Times New Roman Regular"/>
+          <w:rFonts w:ascii="Times New Roman" w:hAnsi="Times New Roman" w:cs="Times New Roman" w:eastAsia="Times New Roman"/>
         </w:rPr>
       </w:pPr>
       <w:r>
@@ -3805,7 +3642,7 @@
     <w:p>
       <w:pPr>
         <w:rPr>
-          <w:rFonts w:ascii="Times New Roman Regular" w:hAnsi="Times New Roman Regular" w:cs="Times New Roman Regular"/>
+          <w:rFonts w:ascii="Times New Roman" w:hAnsi="Times New Roman" w:cs="Times New Roman" w:eastAsia="Times New Roman"/>
         </w:rPr>
       </w:pPr>
       <w:r>
@@ -3819,7 +3656,7 @@
     <w:p>
       <w:pPr>
         <w:rPr>
-          <w:rFonts w:ascii="Times New Roman Regular" w:hAnsi="Times New Roman Regular" w:cs="Times New Roman Regular"/>
+          <w:rFonts w:ascii="Times New Roman" w:hAnsi="Times New Roman" w:cs="Times New Roman" w:eastAsia="Times New Roman"/>
         </w:rPr>
       </w:pPr>
       <w:r>
@@ -3833,7 +3670,7 @@
     <w:p>
       <w:pPr>
         <w:rPr>
-          <w:rFonts w:ascii="Times New Roman Regular" w:hAnsi="Times New Roman Regular" w:cs="Times New Roman Regular"/>
+          <w:rFonts w:ascii="Times New Roman" w:hAnsi="Times New Roman" w:cs="Times New Roman" w:eastAsia="Times New Roman"/>
         </w:rPr>
       </w:pPr>
       <w:r>
@@ -3847,7 +3684,7 @@
     <w:p>
       <w:pPr>
         <w:rPr>
-          <w:rFonts w:ascii="Times New Roman Regular" w:hAnsi="Times New Roman Regular" w:cs="Times New Roman Regular"/>
+          <w:rFonts w:ascii="Times New Roman" w:hAnsi="Times New Roman" w:cs="Times New Roman" w:eastAsia="Times New Roman"/>
         </w:rPr>
       </w:pPr>
       <w:r>
@@ -3861,7 +3698,7 @@
     <w:p>
       <w:pPr>
         <w:rPr>
-          <w:rFonts w:ascii="Times New Roman Regular" w:hAnsi="Times New Roman Regular" w:cs="Times New Roman Regular"/>
+          <w:rFonts w:ascii="Times New Roman" w:hAnsi="Times New Roman" w:cs="Times New Roman" w:eastAsia="Times New Roman"/>
         </w:rPr>
       </w:pPr>
       <w:r>
@@ -3883,14 +3720,14 @@
     <w:p>
       <w:pPr>
         <w:rPr>
-          <w:rFonts w:ascii="Times New Roman Regular" w:hAnsi="Times New Roman Regular" w:cs="Times New Roman Regular" w:hint="eastAsia"/>
-        </w:rPr>
-      </w:pPr>
-    </w:p>
-    <w:p>
-      <w:pPr>
-        <w:rPr>
-          <w:rFonts w:ascii="Times New Roman Bold" w:hAnsi="Times New Roman Bold" w:cs="Times New Roman Bold"/>
+          <w:rFonts w:ascii="Times New Roman" w:hAnsi="Times New Roman" w:cs="Times New Roman" w:hint="eastAsia" w:eastAsia="Times New Roman"/>
+        </w:rPr>
+      </w:pPr>
+    </w:p>
+    <w:p>
+      <w:pPr>
+        <w:rPr>
+          <w:rFonts w:ascii="Times New Roman" w:hAnsi="Times New Roman" w:cs="Times New Roman" w:eastAsia="Times New Roman"/>
           <w:b/>
           <w:bCs/>
         </w:rPr>
@@ -3923,7 +3760,7 @@
     <w:p>
       <w:pPr>
         <w:rPr>
-          <w:rFonts w:ascii="Times New Roman Bold" w:hAnsi="Times New Roman Bold" w:cs="Times New Roman Bold"/>
+          <w:rFonts w:ascii="Times New Roman" w:hAnsi="Times New Roman" w:cs="Times New Roman" w:eastAsia="Times New Roman"/>
           <w:b/>
           <w:bCs/>
         </w:rPr>
@@ -3939,7 +3776,7 @@
     <w:p>
       <w:pPr>
         <w:rPr>
-          <w:rFonts w:ascii="Times New Roman Bold" w:hAnsi="Times New Roman Bold" w:cs="Times New Roman Bold"/>
+          <w:rFonts w:ascii="Times New Roman" w:hAnsi="Times New Roman" w:cs="Times New Roman" w:eastAsia="Times New Roman"/>
           <w:b/>
           <w:bCs/>
         </w:rPr>
@@ -3955,14 +3792,14 @@
     <w:p>
       <w:pPr>
         <w:rPr>
-          <w:rFonts w:ascii="Times New Roman Regular" w:hAnsi="Times New Roman Regular" w:cs="Times New Roman Regular"/>
-        </w:rPr>
-      </w:pPr>
-    </w:p>
-    <w:p>
-      <w:pPr>
-        <w:rPr>
-          <w:rFonts w:ascii="Times New Roman Bold" w:hAnsi="Times New Roman Bold" w:cs="Times New Roman Bold"/>
+          <w:rFonts w:ascii="Times New Roman" w:hAnsi="Times New Roman" w:cs="Times New Roman" w:eastAsia="Times New Roman"/>
+        </w:rPr>
+      </w:pPr>
+    </w:p>
+    <w:p>
+      <w:pPr>
+        <w:rPr>
+          <w:rFonts w:ascii="Times New Roman" w:hAnsi="Times New Roman" w:cs="Times New Roman" w:eastAsia="Times New Roman"/>
           <w:b/>
           <w:bCs/>
         </w:rPr>
@@ -4070,7 +3907,7 @@
     <w:p>
       <w:pPr>
         <w:rPr>
-          <w:rFonts w:ascii="Times New Roman Bold" w:hAnsi="Times New Roman Bold" w:cs="Times New Roman Bold"/>
+          <w:rFonts w:ascii="Times New Roman" w:hAnsi="Times New Roman" w:cs="Times New Roman" w:eastAsia="Times New Roman"/>
           <w:b/>
           <w:bCs/>
         </w:rPr>
@@ -4460,6 +4297,7 @@
       <w:jc w:val="both"/>
     </w:pPr>
     <w:rPr>
+      <w:rFonts w:ascii="Times New Roman" w:hAnsi="Times New Roman"/>
       <w:kern w:val="2"/>
       <w:sz w:val="21"/>
       <w:szCs w:val="24"/>
@@ -4470,12 +4308,18 @@
     <w:uiPriority w:val="1"/>
     <w:semiHidden/>
     <w:unhideWhenUsed/>
+    <w:rPr>
+      <w:rFonts w:ascii="Times New Roman" w:hAnsi="Times New Roman"/>
+    </w:rPr>
   </w:style>
   <w:style w:type="table" w:default="1" w:styleId="a1">
     <w:name w:val="Normal Table"/>
     <w:uiPriority w:val="99"/>
     <w:semiHidden/>
     <w:unhideWhenUsed/>
+    <w:rPr>
+      <w:rFonts w:ascii="Times New Roman" w:hAnsi="Times New Roman"/>
+    </w:rPr>
     <w:tblPr>
       <w:tblInd w:w="0" w:type="dxa"/>
       <w:tblCellMar>

</xml_diff>